<commit_message>
Updated Documentation for Rel DL Grammar and DL Grammar
</commit_message>
<xml_diff>
--- a/DocumentationAndSampleExamples/Documentation/ParserGrammar.docx
+++ b/DocumentationAndSampleExamples/Documentation/ParserGrammar.docx
@@ -13,7 +13,28 @@
     </w:p>
     <w:p>
       <w:r>
-        <w:t>The below is the documentation related to the syntax of Differential Dynamic Logic (DL) and Relational Dynamic Logic (Rel DL). Please refer it and create the input files to pass to the tool and generate Abstract Syntax Trees (AST) or KeYmaeraX outputs.</w:t>
+        <w:rPr/>
+        <w:t>Below</w:t>
+      </w:r>
+      <w:r>
+        <w:rPr/>
+        <w:t xml:space="preserve"> is the documentation related to the syntax of Differential Dynamic Logic (DL) and Relational Dynamic Logic (Rel DL). Please </w:t>
+      </w:r>
+      <w:r>
+        <w:rPr/>
+        <w:t>refer to</w:t>
+      </w:r>
+      <w:r>
+        <w:rPr/>
+        <w:t xml:space="preserve"> it and create the input files to pass to the tool and generate Abstract Syntax Trees (AST) or </w:t>
+      </w:r>
+      <w:r>
+        <w:rPr/>
+        <w:t>KeYmaeraX</w:t>
+      </w:r>
+      <w:r>
+        <w:rPr/>
+        <w:t xml:space="preserve"> outputs.</w:t>
       </w:r>
     </w:p>
     <w:p>
@@ -72,16 +93,32 @@
           <w:ilvl w:val="0"/>
           <w:numId w:val="1"/>
         </w:numPr>
-      </w:pPr>
-      <w:r>
+        <w:rPr/>
+      </w:pPr>
+      <w:r>
+        <w:rPr/>
         <w:t>!</w:t>
       </w:r>
       <w:r>
-        <w:t xml:space="preserve"> </w:t>
-      </w:r>
-      <w:r>
+        <w:rPr/>
+        <w:t xml:space="preserve"> </w:t>
+      </w:r>
+      <w:r>
+        <w:rPr/>
+        <w:t>(</w:t>
+      </w:r>
+      <w:r>
+        <w:rPr/>
+        <w:t xml:space="preserve"> </w:t>
+      </w:r>
+      <w:r>
+        <w:rPr/>
         <w:t>formula</w:t>
       </w:r>
+      <w:r>
+        <w:rPr/>
+        <w:t xml:space="preserve"> )</w:t>
+      </w:r>
     </w:p>
     <w:p>
       <w:pPr>
@@ -296,15 +333,89 @@
           <w:ilvl w:val="0"/>
           <w:numId w:val="2"/>
         </w:numPr>
-      </w:pPr>
-      <w:r>
-        <w:t xml:space="preserve">{ </w:t>
-      </w:r>
-      <w:r>
-        <w:t>IDENTIFIER_PRIME</w:t>
-      </w:r>
-      <w:r>
-        <w:t xml:space="preserve"> = term &amp;&amp; formula }</w:t>
+        <w:rPr/>
+      </w:pPr>
+      <w:r>
+        <w:rPr/>
+        <w:t>{</w:t>
+      </w:r>
+      <w:r>
+        <w:rPr/>
+        <w:t xml:space="preserve"> </w:t>
+      </w:r>
+      <w:r>
+        <w:rPr/>
+        <w:t>differentialEquation</w:t>
+      </w:r>
+      <w:r>
+        <w:rPr/>
+        <w:t xml:space="preserve"> (, </w:t>
+      </w:r>
+      <w:r>
+        <w:rPr/>
+        <w:t>differentialEquation</w:t>
+      </w:r>
+      <w:r>
+        <w:rPr/>
+        <w:t>)*</w:t>
+      </w:r>
+      <w:r>
+        <w:rPr/>
+        <w:t xml:space="preserve"> </w:t>
+      </w:r>
+      <w:r>
+        <w:rPr/>
+        <w:t xml:space="preserve">&amp;&amp; </w:t>
+      </w:r>
+      <w:r>
+        <w:rPr/>
+        <w:t>formula }</w:t>
+      </w:r>
+    </w:p>
+    <w:p>
+      <w:pPr>
+        <w:pStyle w:val="Normal"/>
+        <w:rPr>
+          <w:sz w:val="24"/>
+          <w:szCs w:val="24"/>
+        </w:rPr>
+      </w:pPr>
+      <w:r>
+        <w:rPr>
+          <w:rFonts w:ascii="Aptos Display" w:hAnsi="Aptos Display" w:eastAsia="" w:cs="" w:asciiTheme="majorAscii" w:hAnsiTheme="majorAscii" w:eastAsiaTheme="majorEastAsia" w:cstheme="majorBidi"/>
+          <w:color w:val="0F4761" w:themeColor="accent1" w:themeTint="FF" w:themeShade="BF"/>
+          <w:sz w:val="32"/>
+          <w:szCs w:val="32"/>
+          <w:lang w:eastAsia="en-US" w:bidi="ar-SA"/>
+        </w:rPr>
+        <w:t>differentialEquation:</w:t>
+      </w:r>
+      <w:r>
+        <w:rPr>
+          <w:sz w:val="24"/>
+          <w:szCs w:val="24"/>
+        </w:rPr>
+        <w:t xml:space="preserve"> </w:t>
+      </w:r>
+    </w:p>
+    <w:p>
+      <w:pPr>
+        <w:pStyle w:val="ListParagraph"/>
+        <w:numPr>
+          <w:ilvl w:val="0"/>
+          <w:numId w:val="8"/>
+        </w:numPr>
+        <w:rPr>
+          <w:sz w:val="24"/>
+          <w:szCs w:val="24"/>
+        </w:rPr>
+      </w:pPr>
+      <w:r>
+        <w:rPr>
+          <w:sz w:val="24"/>
+          <w:szCs w:val="24"/>
+        </w:rPr>
+        <w:t>IDENTIFIER_PRIME = term</w:t>
       </w:r>
     </w:p>
     <w:p>
@@ -431,15 +542,47 @@
           <w:ilvl w:val="0"/>
           <w:numId w:val="3"/>
         </w:numPr>
-      </w:pPr>
-      <w:r>
-        <w:t>NUMBER: [0-9]</w:t>
-      </w:r>
-      <w:r>
+        <w:rPr/>
+      </w:pPr>
+      <w:r>
+        <w:rPr/>
+        <w:t xml:space="preserve">NUMBER: </w:t>
+      </w:r>
+      <w:r>
+        <w:rPr/>
+        <w:t xml:space="preserve">-? </w:t>
+      </w:r>
+      <w:r>
+        <w:rPr/>
+        <w:t>[0-</w:t>
+      </w:r>
+      <w:r>
+        <w:rPr/>
+        <w:t>9]</w:t>
+      </w:r>
+      <w:r>
+        <w:rPr/>
         <w:t>+</w:t>
       </w:r>
       <w:r>
-        <w:t>.[0-9]+</w:t>
+        <w:rPr/>
+        <w:t xml:space="preserve"> </w:t>
+      </w:r>
+      <w:r>
+        <w:rPr/>
+        <w:t>.</w:t>
+      </w:r>
+      <w:r>
+        <w:rPr/>
+        <w:t xml:space="preserve"> </w:t>
+      </w:r>
+      <w:r>
+        <w:rPr/>
+        <w:t>[0-</w:t>
+      </w:r>
+      <w:r>
+        <w:rPr/>
+        <w:t>9]+</w:t>
       </w:r>
     </w:p>
     <w:p>
@@ -671,18 +814,52 @@
           <w:ilvl w:val="0"/>
           <w:numId w:val="3"/>
         </w:numPr>
-      </w:pPr>
-      <w:r>
+        <w:rPr/>
+      </w:pPr>
+      <w:r>
+        <w:rPr/>
         <w:t>!#</w:t>
       </w:r>
       <w:r>
-        <w:t xml:space="preserve"> </w:t>
-      </w:r>
+        <w:rPr/>
+        <w:t xml:space="preserve"> (# </w:t>
+      </w:r>
+      <w:r>
+        <w:rPr/>
+        <w:t>relFormula</w:t>
+      </w:r>
+      <w:r>
+        <w:rPr/>
+        <w:t xml:space="preserve"> )#</w:t>
+      </w:r>
+    </w:p>
+    <w:p>
+      <w:pPr>
+        <w:pStyle w:val="ListParagraph"/>
+        <w:numPr>
+          <w:ilvl w:val="0"/>
+          <w:numId w:val="3"/>
+        </w:numPr>
+      </w:pPr>
       <w:proofErr w:type="spellStart"/>
       <w:r>
         <w:t>relFormula</w:t>
       </w:r>
       <w:proofErr w:type="spellEnd"/>
+      <w:r>
+        <w:t xml:space="preserve"> </w:t>
+      </w:r>
+      <w:r>
+        <w:t>&amp;&amp;#</w:t>
+      </w:r>
+      <w:r>
+        <w:t xml:space="preserve"> </w:t>
+      </w:r>
+      <w:proofErr w:type="spellStart"/>
+      <w:r>
+        <w:t>relFormula</w:t>
+      </w:r>
+      <w:proofErr w:type="spellEnd"/>
     </w:p>
     <w:p>
       <w:pPr>
@@ -701,16 +878,361 @@
         <w:t xml:space="preserve"> </w:t>
       </w:r>
       <w:r>
+        <w:t>||#</w:t>
+      </w:r>
+      <w:r>
+        <w:t xml:space="preserve"> </w:t>
+      </w:r>
+      <w:proofErr w:type="spellStart"/>
+      <w:r>
+        <w:t>relFormula</w:t>
+      </w:r>
+      <w:proofErr w:type="spellEnd"/>
+    </w:p>
+    <w:p>
+      <w:pPr>
+        <w:pStyle w:val="ListParagraph"/>
+        <w:numPr>
+          <w:ilvl w:val="0"/>
+          <w:numId w:val="3"/>
+        </w:numPr>
+      </w:pPr>
+      <w:proofErr w:type="spellStart"/>
+      <w:r>
+        <w:t>relFormula</w:t>
+      </w:r>
+      <w:proofErr w:type="spellEnd"/>
+      <w:r>
+        <w:t xml:space="preserve"> </w:t>
+      </w:r>
+      <w:r>
+        <w:t>-&gt;#</w:t>
+      </w:r>
+      <w:r>
+        <w:t xml:space="preserve"> </w:t>
+      </w:r>
+      <w:proofErr w:type="spellStart"/>
+      <w:r>
+        <w:t>relFormula</w:t>
+      </w:r>
+      <w:proofErr w:type="spellEnd"/>
+    </w:p>
+    <w:p>
+      <w:pPr>
+        <w:pStyle w:val="ListParagraph"/>
+        <w:numPr>
+          <w:ilvl w:val="0"/>
+          <w:numId w:val="3"/>
+        </w:numPr>
+      </w:pPr>
+      <w:proofErr w:type="spellStart"/>
+      <w:r>
+        <w:t>relFormula</w:t>
+      </w:r>
+      <w:proofErr w:type="spellEnd"/>
+      <w:r>
+        <w:t xml:space="preserve"> </w:t>
+      </w:r>
+      <w:r>
+        <w:t>&lt;-&gt;#</w:t>
+      </w:r>
+      <w:r>
+        <w:t xml:space="preserve"> </w:t>
+      </w:r>
+      <w:proofErr w:type="spellStart"/>
+      <w:r>
+        <w:t>relFormula</w:t>
+      </w:r>
+      <w:proofErr w:type="spellEnd"/>
+    </w:p>
+    <w:p>
+      <w:pPr>
+        <w:pStyle w:val="ListParagraph"/>
+        <w:numPr>
+          <w:ilvl w:val="0"/>
+          <w:numId w:val="3"/>
+        </w:numPr>
+      </w:pPr>
+      <w:r>
+        <w:t>[#</w:t>
+      </w:r>
+      <w:r>
+        <w:t xml:space="preserve"> </w:t>
+      </w:r>
+      <w:proofErr w:type="spellStart"/>
+      <w:r>
+        <w:t>relProgram</w:t>
+      </w:r>
+      <w:proofErr w:type="spellEnd"/>
+      <w:r>
+        <w:t xml:space="preserve"> </w:t>
+      </w:r>
+      <w:r>
+        <w:t>]#</w:t>
+      </w:r>
+      <w:r>
+        <w:t xml:space="preserve"> </w:t>
+      </w:r>
+      <w:proofErr w:type="spellStart"/>
+      <w:r>
+        <w:t>relFormula</w:t>
+      </w:r>
+      <w:proofErr w:type="spellEnd"/>
+    </w:p>
+    <w:p>
+      <w:pPr>
+        <w:pStyle w:val="ListParagraph"/>
+        <w:numPr>
+          <w:ilvl w:val="0"/>
+          <w:numId w:val="3"/>
+        </w:numPr>
+      </w:pPr>
+      <w:r>
+        <w:t>&lt;&lt;#</w:t>
+      </w:r>
+      <w:r>
+        <w:t xml:space="preserve"> </w:t>
+      </w:r>
+      <w:proofErr w:type="spellStart"/>
+      <w:r>
+        <w:t>relProgram</w:t>
+      </w:r>
+      <w:proofErr w:type="spellEnd"/>
+      <w:r>
+        <w:t xml:space="preserve"> </w:t>
+      </w:r>
+      <w:r>
+        <w:t>&gt;&gt;#</w:t>
+      </w:r>
+      <w:r>
+        <w:t xml:space="preserve"> </w:t>
+      </w:r>
+      <w:proofErr w:type="spellStart"/>
+      <w:r>
+        <w:t>relFormula</w:t>
+      </w:r>
+      <w:proofErr w:type="spellEnd"/>
+    </w:p>
+    <w:p>
+      <w:pPr>
+        <w:pStyle w:val="Heading2"/>
+      </w:pPr>
+      <w:proofErr w:type="spellStart"/>
+      <w:r>
+        <w:t>relProgram</w:t>
+      </w:r>
+      <w:proofErr w:type="spellEnd"/>
+      <w:r>
+        <w:t>:</w:t>
+      </w:r>
+    </w:p>
+    <w:p>
+      <w:pPr>
+        <w:pStyle w:val="ListParagraph"/>
+        <w:numPr>
+          <w:ilvl w:val="0"/>
+          <w:numId w:val="3"/>
+        </w:numPr>
+      </w:pPr>
+      <w:r>
+        <w:t xml:space="preserve">IDENTIFIER </w:t>
+      </w:r>
+      <w:r>
+        <w:t>:=#</w:t>
+      </w:r>
+      <w:r>
+        <w:t xml:space="preserve"> </w:t>
+      </w:r>
+      <w:r>
+        <w:t>term</w:t>
+      </w:r>
+    </w:p>
+    <w:p>
+      <w:pPr>
+        <w:pStyle w:val="ListParagraph"/>
+        <w:numPr>
+          <w:ilvl w:val="0"/>
+          <w:numId w:val="3"/>
+        </w:numPr>
+      </w:pPr>
+      <w:r>
+        <w:t xml:space="preserve">IDENTIFIER </w:t>
+      </w:r>
+      <w:r>
+        <w:t>:=#</w:t>
+      </w:r>
+      <w:r>
+        <w:t xml:space="preserve"> **</w:t>
+      </w:r>
+    </w:p>
+    <w:p>
+      <w:pPr>
+        <w:pStyle w:val="ListParagraph"/>
+        <w:numPr>
+          <w:ilvl w:val="0"/>
+          <w:numId w:val="3"/>
+        </w:numPr>
+      </w:pPr>
+      <w:proofErr w:type="spellStart"/>
+      <w:r>
+        <w:t>relProgram</w:t>
+      </w:r>
+      <w:proofErr w:type="spellEnd"/>
+      <w:r>
+        <w:t xml:space="preserve"> </w:t>
+      </w:r>
+      <w:r>
+        <w:t>;#</w:t>
+      </w:r>
+      <w:r>
+        <w:t xml:space="preserve"> </w:t>
+      </w:r>
+      <w:proofErr w:type="spellStart"/>
+      <w:r>
+        <w:t>relProgram</w:t>
+      </w:r>
+      <w:proofErr w:type="spellEnd"/>
+    </w:p>
+    <w:p>
+      <w:pPr>
+        <w:pStyle w:val="ListParagraph"/>
+        <w:numPr>
+          <w:ilvl w:val="0"/>
+          <w:numId w:val="3"/>
+        </w:numPr>
+      </w:pPr>
+      <w:proofErr w:type="spellStart"/>
+      <w:r>
+        <w:t>relProgram</w:t>
+      </w:r>
+      <w:proofErr w:type="spellEnd"/>
+      <w:r>
+        <w:t xml:space="preserve"> </w:t>
+      </w:r>
+      <w:r>
+        <w:t>++#</w:t>
+      </w:r>
+      <w:r>
+        <w:t xml:space="preserve"> </w:t>
+      </w:r>
+      <w:proofErr w:type="spellStart"/>
+      <w:r>
+        <w:t>relProgram</w:t>
+      </w:r>
+      <w:proofErr w:type="spellEnd"/>
+    </w:p>
+    <w:p>
+      <w:pPr>
+        <w:pStyle w:val="ListParagraph"/>
+        <w:numPr>
+          <w:ilvl w:val="0"/>
+          <w:numId w:val="3"/>
+        </w:numPr>
+      </w:pPr>
+      <w:r>
+        <w:t>{#</w:t>
+      </w:r>
+      <w:r>
+        <w:t xml:space="preserve"> </w:t>
+      </w:r>
+      <w:proofErr w:type="spellStart"/>
+      <w:r>
+        <w:t>relProgram</w:t>
+      </w:r>
+      <w:proofErr w:type="spellEnd"/>
+      <w:r>
+        <w:t xml:space="preserve"> </w:t>
+      </w:r>
+      <w:r>
+        <w:t>}#</w:t>
+      </w:r>
+      <w:r>
+        <w:t xml:space="preserve"> </w:t>
+      </w:r>
+      <w:r>
+        <w:t>**</w:t>
+      </w:r>
+    </w:p>
+    <w:p>
+      <w:pPr>
+        <w:pStyle w:val="ListParagraph"/>
+        <w:numPr>
+          <w:ilvl w:val="0"/>
+          <w:numId w:val="3"/>
+        </w:numPr>
+      </w:pPr>
+      <w:r>
+        <w:t>?#</w:t>
+      </w:r>
+      <w:r>
+        <w:t xml:space="preserve"> </w:t>
+      </w:r>
+      <w:proofErr w:type="spellStart"/>
+      <w:r>
+        <w:t>relFormula</w:t>
+      </w:r>
+      <w:proofErr w:type="spellEnd"/>
+    </w:p>
+    <w:p>
+      <w:pPr>
+        <w:pStyle w:val="ListParagraph"/>
+        <w:numPr>
+          <w:ilvl w:val="0"/>
+          <w:numId w:val="3"/>
+        </w:numPr>
+        <w:rPr>
+          <w:sz w:val="24"/>
+          <w:szCs w:val="24"/>
+        </w:rPr>
+      </w:pPr>
+      <w:r>
+        <w:rPr/>
+        <w:t>{#</w:t>
+      </w:r>
+      <w:r>
+        <w:rPr/>
+        <w:t xml:space="preserve"> </w:t>
+      </w:r>
+      <w:r>
+        <w:rPr/>
+        <w:t>relDifferentialEquation</w:t>
+      </w:r>
+      <w:r>
+        <w:rPr/>
+        <w:t xml:space="preserve"> (, </w:t>
+      </w:r>
+      <w:r>
+        <w:rPr/>
+        <w:t>relDifferentialEquation</w:t>
+      </w:r>
+      <w:r>
+        <w:rPr/>
+        <w:t>)*</w:t>
+      </w:r>
+      <w:r>
+        <w:rPr/>
+        <w:t xml:space="preserve"> </w:t>
+      </w:r>
+      <w:r>
+        <w:rPr/>
         <w:t>&amp;&amp;#</w:t>
       </w:r>
       <w:r>
-        <w:t xml:space="preserve"> </w:t>
-      </w:r>
-      <w:proofErr w:type="spellStart"/>
-      <w:r>
+        <w:rPr/>
+        <w:t xml:space="preserve"> </w:t>
+      </w:r>
+      <w:r>
+        <w:rPr/>
         <w:t>relFormula</w:t>
       </w:r>
-      <w:proofErr w:type="spellEnd"/>
+      <w:r>
+        <w:rPr/>
+        <w:t xml:space="preserve"> </w:t>
+      </w:r>
+      <w:r>
+        <w:rPr/>
+        <w:t>}#</w:t>
+      </w:r>
     </w:p>
     <w:p>
       <w:pPr>
@@ -719,388 +1241,106 @@
           <w:ilvl w:val="0"/>
           <w:numId w:val="3"/>
         </w:numPr>
-      </w:pPr>
-      <w:proofErr w:type="spellStart"/>
-      <w:r>
-        <w:t>relFormula</w:t>
-      </w:r>
-      <w:proofErr w:type="spellEnd"/>
-      <w:r>
-        <w:t xml:space="preserve"> </w:t>
-      </w:r>
-      <w:r>
-        <w:t>||#</w:t>
-      </w:r>
-      <w:r>
-        <w:t xml:space="preserve"> </w:t>
-      </w:r>
-      <w:proofErr w:type="spellStart"/>
-      <w:r>
-        <w:t>relFormula</w:t>
-      </w:r>
-      <w:proofErr w:type="spellEnd"/>
-    </w:p>
-    <w:p>
-      <w:pPr>
-        <w:pStyle w:val="ListParagraph"/>
-        <w:numPr>
-          <w:ilvl w:val="0"/>
-          <w:numId w:val="3"/>
-        </w:numPr>
-      </w:pPr>
-      <w:proofErr w:type="spellStart"/>
-      <w:r>
-        <w:t>relFormula</w:t>
-      </w:r>
-      <w:proofErr w:type="spellEnd"/>
-      <w:r>
-        <w:t xml:space="preserve"> </w:t>
-      </w:r>
-      <w:r>
-        <w:t>-&gt;#</w:t>
-      </w:r>
-      <w:r>
-        <w:t xml:space="preserve"> </w:t>
-      </w:r>
-      <w:proofErr w:type="spellStart"/>
-      <w:r>
-        <w:t>relFormula</w:t>
-      </w:r>
-      <w:proofErr w:type="spellEnd"/>
-    </w:p>
-    <w:p>
-      <w:pPr>
-        <w:pStyle w:val="ListParagraph"/>
-        <w:numPr>
-          <w:ilvl w:val="0"/>
-          <w:numId w:val="3"/>
-        </w:numPr>
-      </w:pPr>
-      <w:proofErr w:type="spellStart"/>
-      <w:r>
-        <w:t>relFormula</w:t>
-      </w:r>
-      <w:proofErr w:type="spellEnd"/>
-      <w:r>
-        <w:t xml:space="preserve"> </w:t>
-      </w:r>
-      <w:r>
-        <w:t>&lt;-&gt;#</w:t>
-      </w:r>
-      <w:r>
-        <w:t xml:space="preserve"> </w:t>
-      </w:r>
-      <w:proofErr w:type="spellStart"/>
-      <w:r>
-        <w:t>relFormula</w:t>
-      </w:r>
-      <w:proofErr w:type="spellEnd"/>
-    </w:p>
-    <w:p>
-      <w:pPr>
-        <w:pStyle w:val="ListParagraph"/>
-        <w:numPr>
-          <w:ilvl w:val="0"/>
-          <w:numId w:val="3"/>
-        </w:numPr>
-      </w:pPr>
-      <w:r>
-        <w:t>[#</w:t>
-      </w:r>
-      <w:r>
-        <w:t xml:space="preserve"> </w:t>
-      </w:r>
-      <w:proofErr w:type="spellStart"/>
-      <w:r>
-        <w:t>relProgram</w:t>
-      </w:r>
-      <w:proofErr w:type="spellEnd"/>
-      <w:r>
-        <w:t xml:space="preserve"> </w:t>
-      </w:r>
-      <w:r>
-        <w:t>]#</w:t>
-      </w:r>
-      <w:r>
-        <w:t xml:space="preserve"> </w:t>
-      </w:r>
-      <w:proofErr w:type="spellStart"/>
-      <w:r>
-        <w:t>relFormula</w:t>
-      </w:r>
-      <w:proofErr w:type="spellEnd"/>
-    </w:p>
-    <w:p>
-      <w:pPr>
-        <w:pStyle w:val="ListParagraph"/>
-        <w:numPr>
-          <w:ilvl w:val="0"/>
-          <w:numId w:val="3"/>
-        </w:numPr>
-      </w:pPr>
-      <w:r>
-        <w:t>&lt;&lt;#</w:t>
-      </w:r>
-      <w:r>
-        <w:t xml:space="preserve"> </w:t>
-      </w:r>
-      <w:proofErr w:type="spellStart"/>
-      <w:r>
-        <w:t>relProgram</w:t>
-      </w:r>
-      <w:proofErr w:type="spellEnd"/>
-      <w:r>
-        <w:t xml:space="preserve"> </w:t>
-      </w:r>
-      <w:r>
-        <w:t>&gt;&gt;#</w:t>
-      </w:r>
-      <w:r>
-        <w:t xml:space="preserve"> </w:t>
-      </w:r>
-      <w:proofErr w:type="spellStart"/>
-      <w:r>
-        <w:t>relFormula</w:t>
-      </w:r>
-      <w:proofErr w:type="spellEnd"/>
-    </w:p>
-    <w:p>
-      <w:pPr>
-        <w:pStyle w:val="Heading2"/>
-      </w:pPr>
-      <w:proofErr w:type="spellStart"/>
-      <w:r>
-        <w:t>relProgram</w:t>
-      </w:r>
-      <w:proofErr w:type="spellEnd"/>
-      <w:r>
+        <w:rPr/>
+      </w:pPr>
+      <w:r>
+        <w:rPr/>
+        <w:t>(#</w:t>
+      </w:r>
+      <w:r>
+        <w:rPr/>
+        <w:t xml:space="preserve"> </w:t>
+      </w:r>
+      <w:r>
+        <w:rPr/>
+        <w:t xml:space="preserve">program </w:t>
+      </w:r>
+      <w:r>
+        <w:rPr/>
+        <w:t>,</w:t>
+      </w:r>
+      <w:r>
+        <w:rPr/>
+        <w:t>#</w:t>
+      </w:r>
+      <w:r>
+        <w:rPr/>
+        <w:t xml:space="preserve"> </w:t>
+      </w:r>
+      <w:r>
+        <w:rPr/>
+        <w:t xml:space="preserve">program </w:t>
+      </w:r>
+      <w:r>
+        <w:rPr/>
+        <w:t>)</w:t>
+      </w:r>
+      <w:r>
+        <w:rPr/>
+        <w:t>#</w:t>
+      </w:r>
+    </w:p>
+    <w:p>
+      <w:pPr>
+        <w:pStyle w:val="Normal"/>
+        <w:rPr>
+          <w:sz w:val="24"/>
+          <w:szCs w:val="24"/>
+        </w:rPr>
+      </w:pPr>
+      <w:r>
+        <w:rPr>
+          <w:rFonts w:ascii="Aptos Display" w:hAnsi="Aptos Display" w:eastAsia="" w:cs="" w:asciiTheme="majorAscii" w:hAnsiTheme="majorAscii" w:eastAsiaTheme="majorEastAsia" w:cstheme="majorBidi"/>
+          <w:color w:val="0F4761" w:themeColor="accent1" w:themeTint="FF" w:themeShade="BF"/>
+          <w:sz w:val="32"/>
+          <w:szCs w:val="32"/>
+          <w:lang w:eastAsia="en-US" w:bidi="ar-SA"/>
+        </w:rPr>
+        <w:t>relDifferentialEquation</w:t>
+      </w:r>
+      <w:r>
+        <w:rPr>
+          <w:rFonts w:ascii="Aptos Display" w:hAnsi="Aptos Display" w:eastAsia="" w:cs="" w:asciiTheme="majorAscii" w:hAnsiTheme="majorAscii" w:eastAsiaTheme="majorEastAsia" w:cstheme="majorBidi"/>
+          <w:color w:val="0F4761" w:themeColor="accent1" w:themeTint="FF" w:themeShade="BF"/>
+          <w:sz w:val="32"/>
+          <w:szCs w:val="32"/>
+          <w:lang w:eastAsia="en-US" w:bidi="ar-SA"/>
+        </w:rPr>
         <w:t>:</w:t>
       </w:r>
-    </w:p>
-    <w:p>
-      <w:pPr>
-        <w:pStyle w:val="ListParagraph"/>
-        <w:numPr>
-          <w:ilvl w:val="0"/>
-          <w:numId w:val="3"/>
-        </w:numPr>
-      </w:pPr>
-      <w:r>
-        <w:t xml:space="preserve">IDENTIFIER </w:t>
-      </w:r>
-      <w:r>
-        <w:t>:=#</w:t>
-      </w:r>
-      <w:r>
-        <w:t xml:space="preserve"> </w:t>
-      </w:r>
-      <w:r>
-        <w:t>term</w:t>
-      </w:r>
-    </w:p>
-    <w:p>
-      <w:pPr>
-        <w:pStyle w:val="ListParagraph"/>
-        <w:numPr>
-          <w:ilvl w:val="0"/>
-          <w:numId w:val="3"/>
-        </w:numPr>
-      </w:pPr>
-      <w:r>
-        <w:t xml:space="preserve">IDENTIFIER </w:t>
-      </w:r>
-      <w:r>
-        <w:t>:=#</w:t>
-      </w:r>
-      <w:r>
-        <w:t xml:space="preserve"> **</w:t>
-      </w:r>
-    </w:p>
-    <w:p>
-      <w:pPr>
-        <w:pStyle w:val="ListParagraph"/>
-        <w:numPr>
-          <w:ilvl w:val="0"/>
-          <w:numId w:val="3"/>
-        </w:numPr>
-      </w:pPr>
-      <w:proofErr w:type="spellStart"/>
-      <w:r>
-        <w:t>relProgram</w:t>
-      </w:r>
-      <w:proofErr w:type="spellEnd"/>
-      <w:r>
-        <w:t xml:space="preserve"> </w:t>
-      </w:r>
-      <w:r>
-        <w:t>;#</w:t>
-      </w:r>
-      <w:r>
-        <w:t xml:space="preserve"> </w:t>
-      </w:r>
-      <w:proofErr w:type="spellStart"/>
-      <w:r>
-        <w:t>relProgram</w:t>
-      </w:r>
-      <w:proofErr w:type="spellEnd"/>
-    </w:p>
-    <w:p>
-      <w:pPr>
-        <w:pStyle w:val="ListParagraph"/>
-        <w:numPr>
-          <w:ilvl w:val="0"/>
-          <w:numId w:val="3"/>
-        </w:numPr>
-      </w:pPr>
-      <w:proofErr w:type="spellStart"/>
-      <w:r>
-        <w:t>relProgram</w:t>
-      </w:r>
-      <w:proofErr w:type="spellEnd"/>
-      <w:r>
-        <w:t xml:space="preserve"> </w:t>
-      </w:r>
-      <w:r>
-        <w:t>++#</w:t>
-      </w:r>
-      <w:r>
-        <w:t xml:space="preserve"> </w:t>
-      </w:r>
-      <w:proofErr w:type="spellStart"/>
-      <w:r>
-        <w:t>relProgram</w:t>
-      </w:r>
-      <w:proofErr w:type="spellEnd"/>
-    </w:p>
-    <w:p>
-      <w:pPr>
-        <w:pStyle w:val="ListParagraph"/>
-        <w:numPr>
-          <w:ilvl w:val="0"/>
-          <w:numId w:val="3"/>
-        </w:numPr>
-      </w:pPr>
-      <w:r>
-        <w:t>{#</w:t>
-      </w:r>
-      <w:r>
-        <w:t xml:space="preserve"> </w:t>
-      </w:r>
-      <w:proofErr w:type="spellStart"/>
-      <w:r>
-        <w:t>relProgram</w:t>
-      </w:r>
-      <w:proofErr w:type="spellEnd"/>
-      <w:r>
-        <w:t xml:space="preserve"> </w:t>
-      </w:r>
-      <w:r>
-        <w:t>}#</w:t>
-      </w:r>
-      <w:r>
-        <w:t xml:space="preserve"> </w:t>
-      </w:r>
-      <w:r>
-        <w:t>**</w:t>
-      </w:r>
-    </w:p>
-    <w:p>
-      <w:pPr>
-        <w:pStyle w:val="ListParagraph"/>
-        <w:numPr>
-          <w:ilvl w:val="0"/>
-          <w:numId w:val="3"/>
-        </w:numPr>
-      </w:pPr>
-      <w:r>
-        <w:t>?#</w:t>
-      </w:r>
-      <w:r>
-        <w:t xml:space="preserve"> </w:t>
-      </w:r>
-      <w:proofErr w:type="spellStart"/>
-      <w:r>
-        <w:t>relFormula</w:t>
-      </w:r>
-      <w:proofErr w:type="spellEnd"/>
-    </w:p>
-    <w:p>
-      <w:pPr>
-        <w:pStyle w:val="ListParagraph"/>
-        <w:numPr>
-          <w:ilvl w:val="0"/>
-          <w:numId w:val="3"/>
-        </w:numPr>
-      </w:pPr>
-      <w:r>
-        <w:t>{#</w:t>
-      </w:r>
-      <w:r>
-        <w:t xml:space="preserve"> </w:t>
-      </w:r>
-      <w:r>
-        <w:t xml:space="preserve">IDENTIFIER_PRIME </w:t>
-      </w:r>
-      <w:r>
-        <w:t>=#</w:t>
-      </w:r>
-      <w:r>
-        <w:t xml:space="preserve"> </w:t>
-      </w:r>
-      <w:proofErr w:type="spellStart"/>
-      <w:r>
+      <w:r>
+        <w:rPr>
+          <w:sz w:val="24"/>
+          <w:szCs w:val="24"/>
+        </w:rPr>
+        <w:t xml:space="preserve"> </w:t>
+      </w:r>
+    </w:p>
+    <w:p>
+      <w:pPr>
+        <w:pStyle w:val="ListParagraph"/>
+        <w:numPr>
+          <w:ilvl w:val="0"/>
+          <w:numId w:val="6"/>
+        </w:numPr>
+        <w:rPr>
+          <w:sz w:val="24"/>
+          <w:szCs w:val="24"/>
+        </w:rPr>
+      </w:pPr>
+      <w:r>
+        <w:rPr>
+          <w:sz w:val="24"/>
+          <w:szCs w:val="24"/>
+        </w:rPr>
+        <w:t xml:space="preserve">IDENTIFIER_PRIME =# </w:t>
+      </w:r>
+      <w:r>
+        <w:rPr>
+          <w:sz w:val="24"/>
+          <w:szCs w:val="24"/>
+        </w:rPr>
         <w:t>relTerm</w:t>
-      </w:r>
-      <w:proofErr w:type="spellEnd"/>
-      <w:r>
-        <w:t xml:space="preserve"> </w:t>
-      </w:r>
-      <w:r>
-        <w:t>&amp;&amp;#</w:t>
-      </w:r>
-      <w:r>
-        <w:t xml:space="preserve"> </w:t>
-      </w:r>
-      <w:proofErr w:type="spellStart"/>
-      <w:r>
-        <w:t>relFormula</w:t>
-      </w:r>
-      <w:proofErr w:type="spellEnd"/>
-      <w:r>
-        <w:t xml:space="preserve"> </w:t>
-      </w:r>
-      <w:r>
-        <w:t>}#</w:t>
-      </w:r>
-    </w:p>
-    <w:p>
-      <w:pPr>
-        <w:pStyle w:val="ListParagraph"/>
-        <w:numPr>
-          <w:ilvl w:val="0"/>
-          <w:numId w:val="3"/>
-        </w:numPr>
-      </w:pPr>
-      <w:r>
-        <w:t>(#</w:t>
-      </w:r>
-      <w:r>
-        <w:t xml:space="preserve"> </w:t>
-      </w:r>
-      <w:r>
-        <w:t xml:space="preserve">program </w:t>
-      </w:r>
-      <w:r>
-        <w:t>,#</w:t>
-      </w:r>
-      <w:r>
-        <w:t xml:space="preserve"> </w:t>
-      </w:r>
-      <w:r>
-        <w:t xml:space="preserve">program </w:t>
-      </w:r>
-      <w:r>
-        <w:t>)#</w:t>
       </w:r>
     </w:p>
     <w:p>
@@ -1198,7 +1438,7 @@
       </w:r>
     </w:p>
     <w:sectPr>
-      <w:pgSz w:w="12240" w:h="15840"/>
+      <w:pgSz w:w="12240" w:h="15840" w:orient="portrait"/>
       <w:pgMar w:top="1440" w:right="1440" w:bottom="1440" w:left="1440" w:header="720" w:footer="720" w:gutter="0"/>
       <w:cols w:space="720"/>
       <w:docGrid w:linePitch="360"/>
@@ -1209,6 +1449,454 @@
 
 <file path=word/numbering.xml><?xml version="1.0" encoding="utf-8"?>
 <w:numbering xmlns:wpc="http://schemas.microsoft.com/office/word/2010/wordprocessingCanvas" xmlns:cx="http://schemas.microsoft.com/office/drawing/2014/chartex" xmlns:cx1="http://schemas.microsoft.com/office/drawing/2015/9/8/chartex" xmlns:cx2="http://schemas.microsoft.com/office/drawing/2015/10/21/chartex" xmlns:cx3="http://schemas.microsoft.com/office/drawing/2016/5/9/chartex" xmlns:cx4="http://schemas.microsoft.com/office/drawing/2016/5/10/chartex" xmlns:cx5="http://schemas.microsoft.com/office/drawing/2016/5/11/chartex" xmlns:cx6="http://schemas.microsoft.com/office/drawing/2016/5/12/chartex" xmlns:cx7="http://schemas.microsoft.com/office/drawing/2016/5/13/chartex" xmlns:cx8="http://schemas.microsoft.com/office/drawing/2016/5/14/chartex" xmlns:mc="http://schemas.openxmlformats.org/markup-compatibility/2006" xmlns:aink="http://schemas.microsoft.com/office/drawing/2016/ink" xmlns:am3d="http://schemas.microsoft.com/office/drawing/2017/model3d" xmlns:o="urn:schemas-microsoft-com:office:office" xmlns:oel="http://schemas.microsoft.com/office/2019/extlst" xmlns:r="http://schemas.openxmlformats.org/officeDocument/2006/relationships" xmlns:m="http://schemas.openxmlformats.org/officeDocument/2006/math" xmlns:v="urn:schemas-microsoft-com:vml" xmlns:wp14="http://schemas.microsoft.com/office/word/2010/wordprocessingDrawing" xmlns:wp="http://schemas.openxmlformats.org/drawingml/2006/wordprocessingDrawing" xmlns:w10="urn:schemas-microsoft-com:office:word" xmlns:w="http://schemas.openxmlformats.org/wordprocessingml/2006/main" xmlns:w14="http://schemas.microsoft.com/office/word/2010/wordml" xmlns:w15="http://schemas.microsoft.com/office/word/2012/wordml" xmlns:w16cex="http://schemas.microsoft.com/office/word/2018/wordml/cex" xmlns:w16cid="http://schemas.microsoft.com/office/word/2016/wordml/cid" xmlns:w16="http://schemas.microsoft.com/office/word/2018/wordml" xmlns:w16du="http://schemas.microsoft.com/office/word/2023/wordml/word16du" xmlns:w16sdtdh="http://schemas.microsoft.com/office/word/2020/wordml/sdtdatahash" xmlns:w16sdtfl="http://schemas.microsoft.com/office/word/2024/wordml/sdtformatlock" xmlns:w16se="http://schemas.microsoft.com/office/word/2015/wordml/symex" xmlns:wpg="http://schemas.microsoft.com/office/word/2010/wordprocessingGroup" xmlns:wpi="http://schemas.microsoft.com/office/word/2010/wordprocessingInk" xmlns:wne="http://schemas.microsoft.com/office/word/2006/wordml" xmlns:wps="http://schemas.microsoft.com/office/word/2010/wordprocessingShape" mc:Ignorable="w14 w15 w16se w16cid w16 w16cex w16sdtdh w16sdtfl w16du wp14">
+  <w:abstractNum xmlns:w="http://schemas.openxmlformats.org/wordprocessingml/2006/main" w:abstractNumId="7">
+    <w:nsid w:val="ba7c53c"/>
+    <w:multiLevelType xmlns:w="http://schemas.openxmlformats.org/wordprocessingml/2006/main" w:val="hybridMultilevel"/>
+    <w:lvl xmlns:w="http://schemas.openxmlformats.org/wordprocessingml/2006/main" w:ilvl="0">
+      <w:start w:val="1"/>
+      <w:numFmt w:val="bullet"/>
+      <w:lvlText w:val=""/>
+      <w:lvlJc w:val="left"/>
+      <w:pPr>
+        <w:ind w:left="720" w:hanging="360"/>
+      </w:pPr>
+      <w:rPr>
+        <w:rFonts w:hint="default" w:ascii="Symbol" w:hAnsi="Symbol"/>
+      </w:rPr>
+    </w:lvl>
+    <w:lvl xmlns:w="http://schemas.openxmlformats.org/wordprocessingml/2006/main" w:ilvl="1">
+      <w:start w:val="1"/>
+      <w:numFmt w:val="bullet"/>
+      <w:lvlText w:val="o"/>
+      <w:lvlJc w:val="left"/>
+      <w:pPr>
+        <w:ind w:left="1440" w:hanging="360"/>
+      </w:pPr>
+      <w:rPr>
+        <w:rFonts w:hint="default" w:ascii="Courier New" w:hAnsi="Courier New"/>
+      </w:rPr>
+    </w:lvl>
+    <w:lvl xmlns:w="http://schemas.openxmlformats.org/wordprocessingml/2006/main" w:ilvl="2">
+      <w:start w:val="1"/>
+      <w:numFmt w:val="bullet"/>
+      <w:lvlText w:val=""/>
+      <w:lvlJc w:val="left"/>
+      <w:pPr>
+        <w:ind w:left="2160" w:hanging="360"/>
+      </w:pPr>
+      <w:rPr>
+        <w:rFonts w:hint="default" w:ascii="Wingdings" w:hAnsi="Wingdings"/>
+      </w:rPr>
+    </w:lvl>
+    <w:lvl xmlns:w="http://schemas.openxmlformats.org/wordprocessingml/2006/main" w:ilvl="3">
+      <w:start w:val="1"/>
+      <w:numFmt w:val="bullet"/>
+      <w:lvlText w:val=""/>
+      <w:lvlJc w:val="left"/>
+      <w:pPr>
+        <w:ind w:left="2880" w:hanging="360"/>
+      </w:pPr>
+      <w:rPr>
+        <w:rFonts w:hint="default" w:ascii="Symbol" w:hAnsi="Symbol"/>
+      </w:rPr>
+    </w:lvl>
+    <w:lvl xmlns:w="http://schemas.openxmlformats.org/wordprocessingml/2006/main" w:ilvl="4">
+      <w:start w:val="1"/>
+      <w:numFmt w:val="bullet"/>
+      <w:lvlText w:val="o"/>
+      <w:lvlJc w:val="left"/>
+      <w:pPr>
+        <w:ind w:left="3600" w:hanging="360"/>
+      </w:pPr>
+      <w:rPr>
+        <w:rFonts w:hint="default" w:ascii="Courier New" w:hAnsi="Courier New"/>
+      </w:rPr>
+    </w:lvl>
+    <w:lvl xmlns:w="http://schemas.openxmlformats.org/wordprocessingml/2006/main" w:ilvl="5">
+      <w:start w:val="1"/>
+      <w:numFmt w:val="bullet"/>
+      <w:lvlText w:val=""/>
+      <w:lvlJc w:val="left"/>
+      <w:pPr>
+        <w:ind w:left="4320" w:hanging="360"/>
+      </w:pPr>
+      <w:rPr>
+        <w:rFonts w:hint="default" w:ascii="Wingdings" w:hAnsi="Wingdings"/>
+      </w:rPr>
+    </w:lvl>
+    <w:lvl xmlns:w="http://schemas.openxmlformats.org/wordprocessingml/2006/main" w:ilvl="6">
+      <w:start w:val="1"/>
+      <w:numFmt w:val="bullet"/>
+      <w:lvlText w:val=""/>
+      <w:lvlJc w:val="left"/>
+      <w:pPr>
+        <w:ind w:left="5040" w:hanging="360"/>
+      </w:pPr>
+      <w:rPr>
+        <w:rFonts w:hint="default" w:ascii="Symbol" w:hAnsi="Symbol"/>
+      </w:rPr>
+    </w:lvl>
+    <w:lvl xmlns:w="http://schemas.openxmlformats.org/wordprocessingml/2006/main" w:ilvl="7">
+      <w:start w:val="1"/>
+      <w:numFmt w:val="bullet"/>
+      <w:lvlText w:val="o"/>
+      <w:lvlJc w:val="left"/>
+      <w:pPr>
+        <w:ind w:left="5760" w:hanging="360"/>
+      </w:pPr>
+      <w:rPr>
+        <w:rFonts w:hint="default" w:ascii="Courier New" w:hAnsi="Courier New"/>
+      </w:rPr>
+    </w:lvl>
+    <w:lvl xmlns:w="http://schemas.openxmlformats.org/wordprocessingml/2006/main" w:ilvl="8">
+      <w:start w:val="1"/>
+      <w:numFmt w:val="bullet"/>
+      <w:lvlText w:val=""/>
+      <w:lvlJc w:val="left"/>
+      <w:pPr>
+        <w:ind w:left="6480" w:hanging="360"/>
+      </w:pPr>
+      <w:rPr>
+        <w:rFonts w:hint="default" w:ascii="Wingdings" w:hAnsi="Wingdings"/>
+      </w:rPr>
+    </w:lvl>
+  </w:abstractNum>
+  <w:abstractNum xmlns:w="http://schemas.openxmlformats.org/wordprocessingml/2006/main" w:abstractNumId="6">
+    <w:nsid w:val="69cee3ab"/>
+    <w:multiLevelType xmlns:w="http://schemas.openxmlformats.org/wordprocessingml/2006/main" w:val="hybridMultilevel"/>
+    <w:lvl xmlns:w="http://schemas.openxmlformats.org/wordprocessingml/2006/main" w:ilvl="0">
+      <w:start w:val="1"/>
+      <w:numFmt w:val="bullet"/>
+      <w:lvlText w:val=""/>
+      <w:lvlJc w:val="left"/>
+      <w:pPr>
+        <w:ind w:left="720" w:hanging="360"/>
+      </w:pPr>
+      <w:rPr>
+        <w:rFonts w:hint="default" w:ascii="Symbol" w:hAnsi="Symbol"/>
+      </w:rPr>
+    </w:lvl>
+    <w:lvl xmlns:w="http://schemas.openxmlformats.org/wordprocessingml/2006/main" w:ilvl="1">
+      <w:start w:val="1"/>
+      <w:numFmt w:val="bullet"/>
+      <w:lvlText w:val="o"/>
+      <w:lvlJc w:val="left"/>
+      <w:pPr>
+        <w:ind w:left="1440" w:hanging="360"/>
+      </w:pPr>
+      <w:rPr>
+        <w:rFonts w:hint="default" w:ascii="Courier New" w:hAnsi="Courier New"/>
+      </w:rPr>
+    </w:lvl>
+    <w:lvl xmlns:w="http://schemas.openxmlformats.org/wordprocessingml/2006/main" w:ilvl="2">
+      <w:start w:val="1"/>
+      <w:numFmt w:val="bullet"/>
+      <w:lvlText w:val=""/>
+      <w:lvlJc w:val="left"/>
+      <w:pPr>
+        <w:ind w:left="2160" w:hanging="360"/>
+      </w:pPr>
+      <w:rPr>
+        <w:rFonts w:hint="default" w:ascii="Wingdings" w:hAnsi="Wingdings"/>
+      </w:rPr>
+    </w:lvl>
+    <w:lvl xmlns:w="http://schemas.openxmlformats.org/wordprocessingml/2006/main" w:ilvl="3">
+      <w:start w:val="1"/>
+      <w:numFmt w:val="bullet"/>
+      <w:lvlText w:val=""/>
+      <w:lvlJc w:val="left"/>
+      <w:pPr>
+        <w:ind w:left="2880" w:hanging="360"/>
+      </w:pPr>
+      <w:rPr>
+        <w:rFonts w:hint="default" w:ascii="Symbol" w:hAnsi="Symbol"/>
+      </w:rPr>
+    </w:lvl>
+    <w:lvl xmlns:w="http://schemas.openxmlformats.org/wordprocessingml/2006/main" w:ilvl="4">
+      <w:start w:val="1"/>
+      <w:numFmt w:val="bullet"/>
+      <w:lvlText w:val="o"/>
+      <w:lvlJc w:val="left"/>
+      <w:pPr>
+        <w:ind w:left="3600" w:hanging="360"/>
+      </w:pPr>
+      <w:rPr>
+        <w:rFonts w:hint="default" w:ascii="Courier New" w:hAnsi="Courier New"/>
+      </w:rPr>
+    </w:lvl>
+    <w:lvl xmlns:w="http://schemas.openxmlformats.org/wordprocessingml/2006/main" w:ilvl="5">
+      <w:start w:val="1"/>
+      <w:numFmt w:val="bullet"/>
+      <w:lvlText w:val=""/>
+      <w:lvlJc w:val="left"/>
+      <w:pPr>
+        <w:ind w:left="4320" w:hanging="360"/>
+      </w:pPr>
+      <w:rPr>
+        <w:rFonts w:hint="default" w:ascii="Wingdings" w:hAnsi="Wingdings"/>
+      </w:rPr>
+    </w:lvl>
+    <w:lvl xmlns:w="http://schemas.openxmlformats.org/wordprocessingml/2006/main" w:ilvl="6">
+      <w:start w:val="1"/>
+      <w:numFmt w:val="bullet"/>
+      <w:lvlText w:val=""/>
+      <w:lvlJc w:val="left"/>
+      <w:pPr>
+        <w:ind w:left="5040" w:hanging="360"/>
+      </w:pPr>
+      <w:rPr>
+        <w:rFonts w:hint="default" w:ascii="Symbol" w:hAnsi="Symbol"/>
+      </w:rPr>
+    </w:lvl>
+    <w:lvl xmlns:w="http://schemas.openxmlformats.org/wordprocessingml/2006/main" w:ilvl="7">
+      <w:start w:val="1"/>
+      <w:numFmt w:val="bullet"/>
+      <w:lvlText w:val="o"/>
+      <w:lvlJc w:val="left"/>
+      <w:pPr>
+        <w:ind w:left="5760" w:hanging="360"/>
+      </w:pPr>
+      <w:rPr>
+        <w:rFonts w:hint="default" w:ascii="Courier New" w:hAnsi="Courier New"/>
+      </w:rPr>
+    </w:lvl>
+    <w:lvl xmlns:w="http://schemas.openxmlformats.org/wordprocessingml/2006/main" w:ilvl="8">
+      <w:start w:val="1"/>
+      <w:numFmt w:val="bullet"/>
+      <w:lvlText w:val=""/>
+      <w:lvlJc w:val="left"/>
+      <w:pPr>
+        <w:ind w:left="6480" w:hanging="360"/>
+      </w:pPr>
+      <w:rPr>
+        <w:rFonts w:hint="default" w:ascii="Wingdings" w:hAnsi="Wingdings"/>
+      </w:rPr>
+    </w:lvl>
+  </w:abstractNum>
+  <w:abstractNum xmlns:w="http://schemas.openxmlformats.org/wordprocessingml/2006/main" w:abstractNumId="5">
+    <w:nsid w:val="6ec5f620"/>
+    <w:multiLevelType xmlns:w="http://schemas.openxmlformats.org/wordprocessingml/2006/main" w:val="hybridMultilevel"/>
+    <w:lvl xmlns:w="http://schemas.openxmlformats.org/wordprocessingml/2006/main" w:ilvl="0">
+      <w:start w:val="1"/>
+      <w:numFmt w:val="bullet"/>
+      <w:lvlText w:val=""/>
+      <w:lvlJc w:val="left"/>
+      <w:pPr>
+        <w:ind w:left="720" w:hanging="360"/>
+      </w:pPr>
+      <w:rPr>
+        <w:rFonts w:hint="default" w:ascii="Symbol" w:hAnsi="Symbol"/>
+      </w:rPr>
+    </w:lvl>
+    <w:lvl xmlns:w="http://schemas.openxmlformats.org/wordprocessingml/2006/main" w:ilvl="1">
+      <w:start w:val="1"/>
+      <w:numFmt w:val="bullet"/>
+      <w:lvlText w:val="o"/>
+      <w:lvlJc w:val="left"/>
+      <w:pPr>
+        <w:ind w:left="1440" w:hanging="360"/>
+      </w:pPr>
+      <w:rPr>
+        <w:rFonts w:hint="default" w:ascii="Courier New" w:hAnsi="Courier New"/>
+      </w:rPr>
+    </w:lvl>
+    <w:lvl xmlns:w="http://schemas.openxmlformats.org/wordprocessingml/2006/main" w:ilvl="2">
+      <w:start w:val="1"/>
+      <w:numFmt w:val="bullet"/>
+      <w:lvlText w:val=""/>
+      <w:lvlJc w:val="left"/>
+      <w:pPr>
+        <w:ind w:left="2160" w:hanging="360"/>
+      </w:pPr>
+      <w:rPr>
+        <w:rFonts w:hint="default" w:ascii="Wingdings" w:hAnsi="Wingdings"/>
+      </w:rPr>
+    </w:lvl>
+    <w:lvl xmlns:w="http://schemas.openxmlformats.org/wordprocessingml/2006/main" w:ilvl="3">
+      <w:start w:val="1"/>
+      <w:numFmt w:val="bullet"/>
+      <w:lvlText w:val=""/>
+      <w:lvlJc w:val="left"/>
+      <w:pPr>
+        <w:ind w:left="2880" w:hanging="360"/>
+      </w:pPr>
+      <w:rPr>
+        <w:rFonts w:hint="default" w:ascii="Symbol" w:hAnsi="Symbol"/>
+      </w:rPr>
+    </w:lvl>
+    <w:lvl xmlns:w="http://schemas.openxmlformats.org/wordprocessingml/2006/main" w:ilvl="4">
+      <w:start w:val="1"/>
+      <w:numFmt w:val="bullet"/>
+      <w:lvlText w:val="o"/>
+      <w:lvlJc w:val="left"/>
+      <w:pPr>
+        <w:ind w:left="3600" w:hanging="360"/>
+      </w:pPr>
+      <w:rPr>
+        <w:rFonts w:hint="default" w:ascii="Courier New" w:hAnsi="Courier New"/>
+      </w:rPr>
+    </w:lvl>
+    <w:lvl xmlns:w="http://schemas.openxmlformats.org/wordprocessingml/2006/main" w:ilvl="5">
+      <w:start w:val="1"/>
+      <w:numFmt w:val="bullet"/>
+      <w:lvlText w:val=""/>
+      <w:lvlJc w:val="left"/>
+      <w:pPr>
+        <w:ind w:left="4320" w:hanging="360"/>
+      </w:pPr>
+      <w:rPr>
+        <w:rFonts w:hint="default" w:ascii="Wingdings" w:hAnsi="Wingdings"/>
+      </w:rPr>
+    </w:lvl>
+    <w:lvl xmlns:w="http://schemas.openxmlformats.org/wordprocessingml/2006/main" w:ilvl="6">
+      <w:start w:val="1"/>
+      <w:numFmt w:val="bullet"/>
+      <w:lvlText w:val=""/>
+      <w:lvlJc w:val="left"/>
+      <w:pPr>
+        <w:ind w:left="5040" w:hanging="360"/>
+      </w:pPr>
+      <w:rPr>
+        <w:rFonts w:hint="default" w:ascii="Symbol" w:hAnsi="Symbol"/>
+      </w:rPr>
+    </w:lvl>
+    <w:lvl xmlns:w="http://schemas.openxmlformats.org/wordprocessingml/2006/main" w:ilvl="7">
+      <w:start w:val="1"/>
+      <w:numFmt w:val="bullet"/>
+      <w:lvlText w:val="o"/>
+      <w:lvlJc w:val="left"/>
+      <w:pPr>
+        <w:ind w:left="5760" w:hanging="360"/>
+      </w:pPr>
+      <w:rPr>
+        <w:rFonts w:hint="default" w:ascii="Courier New" w:hAnsi="Courier New"/>
+      </w:rPr>
+    </w:lvl>
+    <w:lvl xmlns:w="http://schemas.openxmlformats.org/wordprocessingml/2006/main" w:ilvl="8">
+      <w:start w:val="1"/>
+      <w:numFmt w:val="bullet"/>
+      <w:lvlText w:val=""/>
+      <w:lvlJc w:val="left"/>
+      <w:pPr>
+        <w:ind w:left="6480" w:hanging="360"/>
+      </w:pPr>
+      <w:rPr>
+        <w:rFonts w:hint="default" w:ascii="Wingdings" w:hAnsi="Wingdings"/>
+      </w:rPr>
+    </w:lvl>
+  </w:abstractNum>
+  <w:abstractNum xmlns:w="http://schemas.openxmlformats.org/wordprocessingml/2006/main" w:abstractNumId="4">
+    <w:nsid w:val="1199089"/>
+    <w:multiLevelType xmlns:w="http://schemas.openxmlformats.org/wordprocessingml/2006/main" w:val="hybridMultilevel"/>
+    <w:lvl xmlns:w="http://schemas.openxmlformats.org/wordprocessingml/2006/main" w:ilvl="0">
+      <w:start w:val="1"/>
+      <w:numFmt w:val="bullet"/>
+      <w:lvlText w:val=""/>
+      <w:lvlJc w:val="left"/>
+      <w:pPr>
+        <w:ind w:left="720" w:hanging="360"/>
+      </w:pPr>
+      <w:rPr>
+        <w:rFonts w:hint="default" w:ascii="Symbol" w:hAnsi="Symbol"/>
+      </w:rPr>
+    </w:lvl>
+    <w:lvl xmlns:w="http://schemas.openxmlformats.org/wordprocessingml/2006/main" w:ilvl="1">
+      <w:start w:val="1"/>
+      <w:numFmt w:val="bullet"/>
+      <w:lvlText w:val="o"/>
+      <w:lvlJc w:val="left"/>
+      <w:pPr>
+        <w:ind w:left="1440" w:hanging="360"/>
+      </w:pPr>
+      <w:rPr>
+        <w:rFonts w:hint="default" w:ascii="Courier New" w:hAnsi="Courier New"/>
+      </w:rPr>
+    </w:lvl>
+    <w:lvl xmlns:w="http://schemas.openxmlformats.org/wordprocessingml/2006/main" w:ilvl="2">
+      <w:start w:val="1"/>
+      <w:numFmt w:val="bullet"/>
+      <w:lvlText w:val=""/>
+      <w:lvlJc w:val="left"/>
+      <w:pPr>
+        <w:ind w:left="2160" w:hanging="360"/>
+      </w:pPr>
+      <w:rPr>
+        <w:rFonts w:hint="default" w:ascii="Wingdings" w:hAnsi="Wingdings"/>
+      </w:rPr>
+    </w:lvl>
+    <w:lvl xmlns:w="http://schemas.openxmlformats.org/wordprocessingml/2006/main" w:ilvl="3">
+      <w:start w:val="1"/>
+      <w:numFmt w:val="bullet"/>
+      <w:lvlText w:val=""/>
+      <w:lvlJc w:val="left"/>
+      <w:pPr>
+        <w:ind w:left="2880" w:hanging="360"/>
+      </w:pPr>
+      <w:rPr>
+        <w:rFonts w:hint="default" w:ascii="Symbol" w:hAnsi="Symbol"/>
+      </w:rPr>
+    </w:lvl>
+    <w:lvl xmlns:w="http://schemas.openxmlformats.org/wordprocessingml/2006/main" w:ilvl="4">
+      <w:start w:val="1"/>
+      <w:numFmt w:val="bullet"/>
+      <w:lvlText w:val="o"/>
+      <w:lvlJc w:val="left"/>
+      <w:pPr>
+        <w:ind w:left="3600" w:hanging="360"/>
+      </w:pPr>
+      <w:rPr>
+        <w:rFonts w:hint="default" w:ascii="Courier New" w:hAnsi="Courier New"/>
+      </w:rPr>
+    </w:lvl>
+    <w:lvl xmlns:w="http://schemas.openxmlformats.org/wordprocessingml/2006/main" w:ilvl="5">
+      <w:start w:val="1"/>
+      <w:numFmt w:val="bullet"/>
+      <w:lvlText w:val=""/>
+      <w:lvlJc w:val="left"/>
+      <w:pPr>
+        <w:ind w:left="4320" w:hanging="360"/>
+      </w:pPr>
+      <w:rPr>
+        <w:rFonts w:hint="default" w:ascii="Wingdings" w:hAnsi="Wingdings"/>
+      </w:rPr>
+    </w:lvl>
+    <w:lvl xmlns:w="http://schemas.openxmlformats.org/wordprocessingml/2006/main" w:ilvl="6">
+      <w:start w:val="1"/>
+      <w:numFmt w:val="bullet"/>
+      <w:lvlText w:val=""/>
+      <w:lvlJc w:val="left"/>
+      <w:pPr>
+        <w:ind w:left="5040" w:hanging="360"/>
+      </w:pPr>
+      <w:rPr>
+        <w:rFonts w:hint="default" w:ascii="Symbol" w:hAnsi="Symbol"/>
+      </w:rPr>
+    </w:lvl>
+    <w:lvl xmlns:w="http://schemas.openxmlformats.org/wordprocessingml/2006/main" w:ilvl="7">
+      <w:start w:val="1"/>
+      <w:numFmt w:val="bullet"/>
+      <w:lvlText w:val="o"/>
+      <w:lvlJc w:val="left"/>
+      <w:pPr>
+        <w:ind w:left="5760" w:hanging="360"/>
+      </w:pPr>
+      <w:rPr>
+        <w:rFonts w:hint="default" w:ascii="Courier New" w:hAnsi="Courier New"/>
+      </w:rPr>
+    </w:lvl>
+    <w:lvl xmlns:w="http://schemas.openxmlformats.org/wordprocessingml/2006/main" w:ilvl="8">
+      <w:start w:val="1"/>
+      <w:numFmt w:val="bullet"/>
+      <w:lvlText w:val=""/>
+      <w:lvlJc w:val="left"/>
+      <w:pPr>
+        <w:ind w:left="6480" w:hanging="360"/>
+      </w:pPr>
+      <w:rPr>
+        <w:rFonts w:hint="default" w:ascii="Wingdings" w:hAnsi="Wingdings"/>
+      </w:rPr>
+    </w:lvl>
+  </w:abstractNum>
   <w:abstractNum w:abstractNumId="0" w15:restartNumberingAfterBreak="0">
     <w:nsid w:val="159E0368"/>
     <w:multiLevelType w:val="hybridMultilevel"/>
@@ -1222,7 +1910,7 @@
         <w:ind w:left="720" w:hanging="360"/>
       </w:pPr>
       <w:rPr>
-        <w:rFonts w:ascii="Symbol" w:hAnsi="Symbol" w:hint="default"/>
+        <w:rFonts w:hint="default" w:ascii="Symbol" w:hAnsi="Symbol"/>
       </w:rPr>
     </w:lvl>
     <w:lvl w:ilvl="1" w:tplc="04090003" w:tentative="1">
@@ -1234,7 +1922,7 @@
         <w:ind w:left="1440" w:hanging="360"/>
       </w:pPr>
       <w:rPr>
-        <w:rFonts w:ascii="Courier New" w:hAnsi="Courier New" w:cs="Courier New" w:hint="default"/>
+        <w:rFonts w:hint="default" w:ascii="Courier New" w:hAnsi="Courier New" w:cs="Courier New"/>
       </w:rPr>
     </w:lvl>
     <w:lvl w:ilvl="2" w:tplc="04090005" w:tentative="1">
@@ -1246,7 +1934,7 @@
         <w:ind w:left="2160" w:hanging="360"/>
       </w:pPr>
       <w:rPr>
-        <w:rFonts w:ascii="Wingdings" w:hAnsi="Wingdings" w:hint="default"/>
+        <w:rFonts w:hint="default" w:ascii="Wingdings" w:hAnsi="Wingdings"/>
       </w:rPr>
     </w:lvl>
     <w:lvl w:ilvl="3" w:tplc="04090001" w:tentative="1">
@@ -1258,7 +1946,7 @@
         <w:ind w:left="2880" w:hanging="360"/>
       </w:pPr>
       <w:rPr>
-        <w:rFonts w:ascii="Symbol" w:hAnsi="Symbol" w:hint="default"/>
+        <w:rFonts w:hint="default" w:ascii="Symbol" w:hAnsi="Symbol"/>
       </w:rPr>
     </w:lvl>
     <w:lvl w:ilvl="4" w:tplc="04090003" w:tentative="1">
@@ -1270,7 +1958,7 @@
         <w:ind w:left="3600" w:hanging="360"/>
       </w:pPr>
       <w:rPr>
-        <w:rFonts w:ascii="Courier New" w:hAnsi="Courier New" w:cs="Courier New" w:hint="default"/>
+        <w:rFonts w:hint="default" w:ascii="Courier New" w:hAnsi="Courier New" w:cs="Courier New"/>
       </w:rPr>
     </w:lvl>
     <w:lvl w:ilvl="5" w:tplc="04090005" w:tentative="1">
@@ -1282,7 +1970,7 @@
         <w:ind w:left="4320" w:hanging="360"/>
       </w:pPr>
       <w:rPr>
-        <w:rFonts w:ascii="Wingdings" w:hAnsi="Wingdings" w:hint="default"/>
+        <w:rFonts w:hint="default" w:ascii="Wingdings" w:hAnsi="Wingdings"/>
       </w:rPr>
     </w:lvl>
     <w:lvl w:ilvl="6" w:tplc="04090001" w:tentative="1">
@@ -1294,7 +1982,7 @@
         <w:ind w:left="5040" w:hanging="360"/>
       </w:pPr>
       <w:rPr>
-        <w:rFonts w:ascii="Symbol" w:hAnsi="Symbol" w:hint="default"/>
+        <w:rFonts w:hint="default" w:ascii="Symbol" w:hAnsi="Symbol"/>
       </w:rPr>
     </w:lvl>
     <w:lvl w:ilvl="7" w:tplc="04090003" w:tentative="1">
@@ -1306,7 +1994,7 @@
         <w:ind w:left="5760" w:hanging="360"/>
       </w:pPr>
       <w:rPr>
-        <w:rFonts w:ascii="Courier New" w:hAnsi="Courier New" w:cs="Courier New" w:hint="default"/>
+        <w:rFonts w:hint="default" w:ascii="Courier New" w:hAnsi="Courier New" w:cs="Courier New"/>
       </w:rPr>
     </w:lvl>
     <w:lvl w:ilvl="8" w:tplc="04090005" w:tentative="1">
@@ -1318,7 +2006,7 @@
         <w:ind w:left="6480" w:hanging="360"/>
       </w:pPr>
       <w:rPr>
-        <w:rFonts w:ascii="Wingdings" w:hAnsi="Wingdings" w:hint="default"/>
+        <w:rFonts w:hint="default" w:ascii="Wingdings" w:hAnsi="Wingdings"/>
       </w:rPr>
     </w:lvl>
   </w:abstractNum>
@@ -1335,7 +2023,7 @@
         <w:ind w:left="720" w:hanging="360"/>
       </w:pPr>
       <w:rPr>
-        <w:rFonts w:ascii="Symbol" w:hAnsi="Symbol" w:hint="default"/>
+        <w:rFonts w:hint="default" w:ascii="Symbol" w:hAnsi="Symbol"/>
       </w:rPr>
     </w:lvl>
     <w:lvl w:ilvl="1" w:tplc="04090003" w:tentative="1">
@@ -1347,7 +2035,7 @@
         <w:ind w:left="1440" w:hanging="360"/>
       </w:pPr>
       <w:rPr>
-        <w:rFonts w:ascii="Courier New" w:hAnsi="Courier New" w:cs="Courier New" w:hint="default"/>
+        <w:rFonts w:hint="default" w:ascii="Courier New" w:hAnsi="Courier New" w:cs="Courier New"/>
       </w:rPr>
     </w:lvl>
     <w:lvl w:ilvl="2" w:tplc="04090005" w:tentative="1">
@@ -1359,7 +2047,7 @@
         <w:ind w:left="2160" w:hanging="360"/>
       </w:pPr>
       <w:rPr>
-        <w:rFonts w:ascii="Wingdings" w:hAnsi="Wingdings" w:hint="default"/>
+        <w:rFonts w:hint="default" w:ascii="Wingdings" w:hAnsi="Wingdings"/>
       </w:rPr>
     </w:lvl>
     <w:lvl w:ilvl="3" w:tplc="04090001" w:tentative="1">
@@ -1371,7 +2059,7 @@
         <w:ind w:left="2880" w:hanging="360"/>
       </w:pPr>
       <w:rPr>
-        <w:rFonts w:ascii="Symbol" w:hAnsi="Symbol" w:hint="default"/>
+        <w:rFonts w:hint="default" w:ascii="Symbol" w:hAnsi="Symbol"/>
       </w:rPr>
     </w:lvl>
     <w:lvl w:ilvl="4" w:tplc="04090003" w:tentative="1">
@@ -1383,7 +2071,7 @@
         <w:ind w:left="3600" w:hanging="360"/>
       </w:pPr>
       <w:rPr>
-        <w:rFonts w:ascii="Courier New" w:hAnsi="Courier New" w:cs="Courier New" w:hint="default"/>
+        <w:rFonts w:hint="default" w:ascii="Courier New" w:hAnsi="Courier New" w:cs="Courier New"/>
       </w:rPr>
     </w:lvl>
     <w:lvl w:ilvl="5" w:tplc="04090005" w:tentative="1">
@@ -1395,7 +2083,7 @@
         <w:ind w:left="4320" w:hanging="360"/>
       </w:pPr>
       <w:rPr>
-        <w:rFonts w:ascii="Wingdings" w:hAnsi="Wingdings" w:hint="default"/>
+        <w:rFonts w:hint="default" w:ascii="Wingdings" w:hAnsi="Wingdings"/>
       </w:rPr>
     </w:lvl>
     <w:lvl w:ilvl="6" w:tplc="04090001" w:tentative="1">
@@ -1407,7 +2095,7 @@
         <w:ind w:left="5040" w:hanging="360"/>
       </w:pPr>
       <w:rPr>
-        <w:rFonts w:ascii="Symbol" w:hAnsi="Symbol" w:hint="default"/>
+        <w:rFonts w:hint="default" w:ascii="Symbol" w:hAnsi="Symbol"/>
       </w:rPr>
     </w:lvl>
     <w:lvl w:ilvl="7" w:tplc="04090003" w:tentative="1">
@@ -1419,7 +2107,7 @@
         <w:ind w:left="5760" w:hanging="360"/>
       </w:pPr>
       <w:rPr>
-        <w:rFonts w:ascii="Courier New" w:hAnsi="Courier New" w:cs="Courier New" w:hint="default"/>
+        <w:rFonts w:hint="default" w:ascii="Courier New" w:hAnsi="Courier New" w:cs="Courier New"/>
       </w:rPr>
     </w:lvl>
     <w:lvl w:ilvl="8" w:tplc="04090005" w:tentative="1">
@@ -1431,7 +2119,7 @@
         <w:ind w:left="6480" w:hanging="360"/>
       </w:pPr>
       <w:rPr>
-        <w:rFonts w:ascii="Wingdings" w:hAnsi="Wingdings" w:hint="default"/>
+        <w:rFonts w:hint="default" w:ascii="Wingdings" w:hAnsi="Wingdings"/>
       </w:rPr>
     </w:lvl>
   </w:abstractNum>
@@ -1448,7 +2136,7 @@
         <w:ind w:left="720" w:hanging="360"/>
       </w:pPr>
       <w:rPr>
-        <w:rFonts w:ascii="Symbol" w:hAnsi="Symbol" w:hint="default"/>
+        <w:rFonts w:hint="default" w:ascii="Symbol" w:hAnsi="Symbol"/>
       </w:rPr>
     </w:lvl>
     <w:lvl w:ilvl="1" w:tplc="04090003" w:tentative="1">
@@ -1460,7 +2148,7 @@
         <w:ind w:left="1440" w:hanging="360"/>
       </w:pPr>
       <w:rPr>
-        <w:rFonts w:ascii="Courier New" w:hAnsi="Courier New" w:cs="Courier New" w:hint="default"/>
+        <w:rFonts w:hint="default" w:ascii="Courier New" w:hAnsi="Courier New" w:cs="Courier New"/>
       </w:rPr>
     </w:lvl>
     <w:lvl w:ilvl="2" w:tplc="04090005" w:tentative="1">
@@ -1472,7 +2160,7 @@
         <w:ind w:left="2160" w:hanging="360"/>
       </w:pPr>
       <w:rPr>
-        <w:rFonts w:ascii="Wingdings" w:hAnsi="Wingdings" w:hint="default"/>
+        <w:rFonts w:hint="default" w:ascii="Wingdings" w:hAnsi="Wingdings"/>
       </w:rPr>
     </w:lvl>
     <w:lvl w:ilvl="3" w:tplc="04090001" w:tentative="1">
@@ -1484,7 +2172,7 @@
         <w:ind w:left="2880" w:hanging="360"/>
       </w:pPr>
       <w:rPr>
-        <w:rFonts w:ascii="Symbol" w:hAnsi="Symbol" w:hint="default"/>
+        <w:rFonts w:hint="default" w:ascii="Symbol" w:hAnsi="Symbol"/>
       </w:rPr>
     </w:lvl>
     <w:lvl w:ilvl="4" w:tplc="04090003" w:tentative="1">
@@ -1496,7 +2184,7 @@
         <w:ind w:left="3600" w:hanging="360"/>
       </w:pPr>
       <w:rPr>
-        <w:rFonts w:ascii="Courier New" w:hAnsi="Courier New" w:cs="Courier New" w:hint="default"/>
+        <w:rFonts w:hint="default" w:ascii="Courier New" w:hAnsi="Courier New" w:cs="Courier New"/>
       </w:rPr>
     </w:lvl>
     <w:lvl w:ilvl="5" w:tplc="04090005" w:tentative="1">
@@ -1508,7 +2196,7 @@
         <w:ind w:left="4320" w:hanging="360"/>
       </w:pPr>
       <w:rPr>
-        <w:rFonts w:ascii="Wingdings" w:hAnsi="Wingdings" w:hint="default"/>
+        <w:rFonts w:hint="default" w:ascii="Wingdings" w:hAnsi="Wingdings"/>
       </w:rPr>
     </w:lvl>
     <w:lvl w:ilvl="6" w:tplc="04090001" w:tentative="1">
@@ -1520,7 +2208,7 @@
         <w:ind w:left="5040" w:hanging="360"/>
       </w:pPr>
       <w:rPr>
-        <w:rFonts w:ascii="Symbol" w:hAnsi="Symbol" w:hint="default"/>
+        <w:rFonts w:hint="default" w:ascii="Symbol" w:hAnsi="Symbol"/>
       </w:rPr>
     </w:lvl>
     <w:lvl w:ilvl="7" w:tplc="04090003" w:tentative="1">
@@ -1532,7 +2220,7 @@
         <w:ind w:left="5760" w:hanging="360"/>
       </w:pPr>
       <w:rPr>
-        <w:rFonts w:ascii="Courier New" w:hAnsi="Courier New" w:cs="Courier New" w:hint="default"/>
+        <w:rFonts w:hint="default" w:ascii="Courier New" w:hAnsi="Courier New" w:cs="Courier New"/>
       </w:rPr>
     </w:lvl>
     <w:lvl w:ilvl="8" w:tplc="04090005" w:tentative="1">
@@ -1544,7 +2232,7 @@
         <w:ind w:left="6480" w:hanging="360"/>
       </w:pPr>
       <w:rPr>
-        <w:rFonts w:ascii="Wingdings" w:hAnsi="Wingdings" w:hint="default"/>
+        <w:rFonts w:hint="default" w:ascii="Wingdings" w:hAnsi="Wingdings"/>
       </w:rPr>
     </w:lvl>
   </w:abstractNum>
@@ -1561,7 +2249,7 @@
         <w:ind w:left="720" w:hanging="360"/>
       </w:pPr>
       <w:rPr>
-        <w:rFonts w:ascii="Symbol" w:hAnsi="Symbol" w:hint="default"/>
+        <w:rFonts w:hint="default" w:ascii="Symbol" w:hAnsi="Symbol"/>
       </w:rPr>
     </w:lvl>
     <w:lvl w:ilvl="1" w:tplc="04090003" w:tentative="1">
@@ -1573,7 +2261,7 @@
         <w:ind w:left="1440" w:hanging="360"/>
       </w:pPr>
       <w:rPr>
-        <w:rFonts w:ascii="Courier New" w:hAnsi="Courier New" w:cs="Courier New" w:hint="default"/>
+        <w:rFonts w:hint="default" w:ascii="Courier New" w:hAnsi="Courier New" w:cs="Courier New"/>
       </w:rPr>
     </w:lvl>
     <w:lvl w:ilvl="2" w:tplc="04090005" w:tentative="1">
@@ -1585,7 +2273,7 @@
         <w:ind w:left="2160" w:hanging="360"/>
       </w:pPr>
       <w:rPr>
-        <w:rFonts w:ascii="Wingdings" w:hAnsi="Wingdings" w:hint="default"/>
+        <w:rFonts w:hint="default" w:ascii="Wingdings" w:hAnsi="Wingdings"/>
       </w:rPr>
     </w:lvl>
     <w:lvl w:ilvl="3" w:tplc="04090001" w:tentative="1">
@@ -1597,7 +2285,7 @@
         <w:ind w:left="2880" w:hanging="360"/>
       </w:pPr>
       <w:rPr>
-        <w:rFonts w:ascii="Symbol" w:hAnsi="Symbol" w:hint="default"/>
+        <w:rFonts w:hint="default" w:ascii="Symbol" w:hAnsi="Symbol"/>
       </w:rPr>
     </w:lvl>
     <w:lvl w:ilvl="4" w:tplc="04090003" w:tentative="1">
@@ -1609,7 +2297,7 @@
         <w:ind w:left="3600" w:hanging="360"/>
       </w:pPr>
       <w:rPr>
-        <w:rFonts w:ascii="Courier New" w:hAnsi="Courier New" w:cs="Courier New" w:hint="default"/>
+        <w:rFonts w:hint="default" w:ascii="Courier New" w:hAnsi="Courier New" w:cs="Courier New"/>
       </w:rPr>
     </w:lvl>
     <w:lvl w:ilvl="5" w:tplc="04090005" w:tentative="1">
@@ -1621,7 +2309,7 @@
         <w:ind w:left="4320" w:hanging="360"/>
       </w:pPr>
       <w:rPr>
-        <w:rFonts w:ascii="Wingdings" w:hAnsi="Wingdings" w:hint="default"/>
+        <w:rFonts w:hint="default" w:ascii="Wingdings" w:hAnsi="Wingdings"/>
       </w:rPr>
     </w:lvl>
     <w:lvl w:ilvl="6" w:tplc="04090001" w:tentative="1">
@@ -1633,7 +2321,7 @@
         <w:ind w:left="5040" w:hanging="360"/>
       </w:pPr>
       <w:rPr>
-        <w:rFonts w:ascii="Symbol" w:hAnsi="Symbol" w:hint="default"/>
+        <w:rFonts w:hint="default" w:ascii="Symbol" w:hAnsi="Symbol"/>
       </w:rPr>
     </w:lvl>
     <w:lvl w:ilvl="7" w:tplc="04090003" w:tentative="1">
@@ -1645,7 +2333,7 @@
         <w:ind w:left="5760" w:hanging="360"/>
       </w:pPr>
       <w:rPr>
-        <w:rFonts w:ascii="Courier New" w:hAnsi="Courier New" w:cs="Courier New" w:hint="default"/>
+        <w:rFonts w:hint="default" w:ascii="Courier New" w:hAnsi="Courier New" w:cs="Courier New"/>
       </w:rPr>
     </w:lvl>
     <w:lvl w:ilvl="8" w:tplc="04090005" w:tentative="1">
@@ -1657,10 +2345,22 @@
         <w:ind w:left="6480" w:hanging="360"/>
       </w:pPr>
       <w:rPr>
-        <w:rFonts w:ascii="Wingdings" w:hAnsi="Wingdings" w:hint="default"/>
+        <w:rFonts w:hint="default" w:ascii="Wingdings" w:hAnsi="Wingdings"/>
       </w:rPr>
     </w:lvl>
   </w:abstractNum>
+  <w:num w:numId="8">
+    <w:abstractNumId w:val="7"/>
+  </w:num>
+  <w:num w:numId="7">
+    <w:abstractNumId w:val="6"/>
+  </w:num>
+  <w:num w:numId="6">
+    <w:abstractNumId w:val="5"/>
+  </w:num>
+  <w:num w:numId="5">
+    <w:abstractNumId w:val="4"/>
+  </w:num>
   <w:num w:numId="1" w16cid:durableId="906450475">
     <w:abstractNumId w:val="3"/>
   </w:num>
@@ -1681,7 +2381,7 @@
   <w:docDefaults>
     <w:rPrDefault>
       <w:rPr>
-        <w:rFonts w:asciiTheme="minorHAnsi" w:eastAsiaTheme="minorHAnsi" w:hAnsiTheme="minorHAnsi" w:cstheme="minorBidi"/>
+        <w:rFonts w:asciiTheme="minorHAnsi" w:hAnsiTheme="minorHAnsi" w:eastAsiaTheme="minorHAnsi" w:cstheme="minorBidi"/>
         <w:kern w:val="2"/>
         <w:sz w:val="24"/>
         <w:szCs w:val="24"/>
@@ -1698,14 +2398,14 @@
   <w:latentStyles w:defLockedState="0" w:defUIPriority="99" w:defSemiHidden="0" w:defUnhideWhenUsed="0" w:defQFormat="0" w:count="376">
     <w:lsdException w:name="Normal" w:uiPriority="0" w:qFormat="1"/>
     <w:lsdException w:name="heading 1" w:uiPriority="9" w:qFormat="1"/>
-    <w:lsdException w:name="heading 2" w:semiHidden="1" w:uiPriority="9" w:unhideWhenUsed="1" w:qFormat="1"/>
-    <w:lsdException w:name="heading 3" w:semiHidden="1" w:uiPriority="9" w:unhideWhenUsed="1" w:qFormat="1"/>
-    <w:lsdException w:name="heading 4" w:semiHidden="1" w:uiPriority="9" w:unhideWhenUsed="1" w:qFormat="1"/>
-    <w:lsdException w:name="heading 5" w:semiHidden="1" w:uiPriority="9" w:unhideWhenUsed="1" w:qFormat="1"/>
-    <w:lsdException w:name="heading 6" w:semiHidden="1" w:uiPriority="9" w:unhideWhenUsed="1" w:qFormat="1"/>
-    <w:lsdException w:name="heading 7" w:semiHidden="1" w:uiPriority="9" w:unhideWhenUsed="1" w:qFormat="1"/>
-    <w:lsdException w:name="heading 8" w:semiHidden="1" w:uiPriority="9" w:unhideWhenUsed="1" w:qFormat="1"/>
-    <w:lsdException w:name="heading 9" w:semiHidden="1" w:uiPriority="9" w:unhideWhenUsed="1" w:qFormat="1"/>
+    <w:lsdException w:name="heading 2" w:uiPriority="9" w:semiHidden="1" w:unhideWhenUsed="1" w:qFormat="1"/>
+    <w:lsdException w:name="heading 3" w:uiPriority="9" w:semiHidden="1" w:unhideWhenUsed="1" w:qFormat="1"/>
+    <w:lsdException w:name="heading 4" w:uiPriority="9" w:semiHidden="1" w:unhideWhenUsed="1" w:qFormat="1"/>
+    <w:lsdException w:name="heading 5" w:uiPriority="9" w:semiHidden="1" w:unhideWhenUsed="1" w:qFormat="1"/>
+    <w:lsdException w:name="heading 6" w:uiPriority="9" w:semiHidden="1" w:unhideWhenUsed="1" w:qFormat="1"/>
+    <w:lsdException w:name="heading 7" w:uiPriority="9" w:semiHidden="1" w:unhideWhenUsed="1" w:qFormat="1"/>
+    <w:lsdException w:name="heading 8" w:uiPriority="9" w:semiHidden="1" w:unhideWhenUsed="1" w:qFormat="1"/>
+    <w:lsdException w:name="heading 9" w:uiPriority="9" w:semiHidden="1" w:unhideWhenUsed="1" w:qFormat="1"/>
     <w:lsdException w:name="index 1" w:semiHidden="1" w:unhideWhenUsed="1"/>
     <w:lsdException w:name="index 2" w:semiHidden="1" w:unhideWhenUsed="1"/>
     <w:lsdException w:name="index 3" w:semiHidden="1" w:unhideWhenUsed="1"/>
@@ -1715,22 +2415,22 @@
     <w:lsdException w:name="index 7" w:semiHidden="1" w:unhideWhenUsed="1"/>
     <w:lsdException w:name="index 8" w:semiHidden="1" w:unhideWhenUsed="1"/>
     <w:lsdException w:name="index 9" w:semiHidden="1" w:unhideWhenUsed="1"/>
-    <w:lsdException w:name="toc 1" w:semiHidden="1" w:uiPriority="39" w:unhideWhenUsed="1"/>
-    <w:lsdException w:name="toc 2" w:semiHidden="1" w:uiPriority="39" w:unhideWhenUsed="1"/>
-    <w:lsdException w:name="toc 3" w:semiHidden="1" w:uiPriority="39" w:unhideWhenUsed="1"/>
-    <w:lsdException w:name="toc 4" w:semiHidden="1" w:uiPriority="39" w:unhideWhenUsed="1"/>
-    <w:lsdException w:name="toc 5" w:semiHidden="1" w:uiPriority="39" w:unhideWhenUsed="1"/>
-    <w:lsdException w:name="toc 6" w:semiHidden="1" w:uiPriority="39" w:unhideWhenUsed="1"/>
-    <w:lsdException w:name="toc 7" w:semiHidden="1" w:uiPriority="39" w:unhideWhenUsed="1"/>
-    <w:lsdException w:name="toc 8" w:semiHidden="1" w:uiPriority="39" w:unhideWhenUsed="1"/>
-    <w:lsdException w:name="toc 9" w:semiHidden="1" w:uiPriority="39" w:unhideWhenUsed="1"/>
+    <w:lsdException w:name="toc 1" w:uiPriority="39" w:semiHidden="1" w:unhideWhenUsed="1"/>
+    <w:lsdException w:name="toc 2" w:uiPriority="39" w:semiHidden="1" w:unhideWhenUsed="1"/>
+    <w:lsdException w:name="toc 3" w:uiPriority="39" w:semiHidden="1" w:unhideWhenUsed="1"/>
+    <w:lsdException w:name="toc 4" w:uiPriority="39" w:semiHidden="1" w:unhideWhenUsed="1"/>
+    <w:lsdException w:name="toc 5" w:uiPriority="39" w:semiHidden="1" w:unhideWhenUsed="1"/>
+    <w:lsdException w:name="toc 6" w:uiPriority="39" w:semiHidden="1" w:unhideWhenUsed="1"/>
+    <w:lsdException w:name="toc 7" w:uiPriority="39" w:semiHidden="1" w:unhideWhenUsed="1"/>
+    <w:lsdException w:name="toc 8" w:uiPriority="39" w:semiHidden="1" w:unhideWhenUsed="1"/>
+    <w:lsdException w:name="toc 9" w:uiPriority="39" w:semiHidden="1" w:unhideWhenUsed="1"/>
     <w:lsdException w:name="Normal Indent" w:semiHidden="1" w:unhideWhenUsed="1"/>
     <w:lsdException w:name="footnote text" w:semiHidden="1" w:unhideWhenUsed="1"/>
     <w:lsdException w:name="annotation text" w:semiHidden="1" w:unhideWhenUsed="1"/>
     <w:lsdException w:name="header" w:semiHidden="1" w:unhideWhenUsed="1"/>
     <w:lsdException w:name="footer" w:semiHidden="1" w:unhideWhenUsed="1"/>
     <w:lsdException w:name="index heading" w:semiHidden="1" w:unhideWhenUsed="1"/>
-    <w:lsdException w:name="caption" w:semiHidden="1" w:uiPriority="35" w:unhideWhenUsed="1" w:qFormat="1"/>
+    <w:lsdException w:name="caption" w:uiPriority="35" w:semiHidden="1" w:unhideWhenUsed="1" w:qFormat="1"/>
     <w:lsdException w:name="table of figures" w:semiHidden="1" w:unhideWhenUsed="1"/>
     <w:lsdException w:name="envelope address" w:semiHidden="1" w:unhideWhenUsed="1"/>
     <w:lsdException w:name="envelope return" w:semiHidden="1" w:unhideWhenUsed="1"/>
@@ -1761,7 +2461,7 @@
     <w:lsdException w:name="Title" w:uiPriority="10" w:qFormat="1"/>
     <w:lsdException w:name="Closing" w:semiHidden="1" w:unhideWhenUsed="1"/>
     <w:lsdException w:name="Signature" w:semiHidden="1" w:unhideWhenUsed="1"/>
-    <w:lsdException w:name="Default Paragraph Font" w:semiHidden="1" w:uiPriority="1" w:unhideWhenUsed="1"/>
+    <w:lsdException w:name="Default Paragraph Font" w:uiPriority="1" w:semiHidden="1" w:unhideWhenUsed="1"/>
     <w:lsdException w:name="Body Text" w:semiHidden="1" w:unhideWhenUsed="1"/>
     <w:lsdException w:name="Body Text Indent" w:semiHidden="1" w:unhideWhenUsed="1"/>
     <w:lsdException w:name="List Continue" w:semiHidden="1" w:unhideWhenUsed="1"/>
@@ -1961,8 +2661,8 @@
     <w:lsdException w:name="Subtle Reference" w:uiPriority="31" w:qFormat="1"/>
     <w:lsdException w:name="Intense Reference" w:uiPriority="32" w:qFormat="1"/>
     <w:lsdException w:name="Book Title" w:uiPriority="33" w:qFormat="1"/>
-    <w:lsdException w:name="Bibliography" w:semiHidden="1" w:uiPriority="37" w:unhideWhenUsed="1"/>
-    <w:lsdException w:name="TOC Heading" w:semiHidden="1" w:uiPriority="39" w:unhideWhenUsed="1" w:qFormat="1"/>
+    <w:lsdException w:name="Bibliography" w:uiPriority="37" w:semiHidden="1" w:unhideWhenUsed="1"/>
+    <w:lsdException w:name="TOC Heading" w:uiPriority="39" w:semiHidden="1" w:unhideWhenUsed="1" w:qFormat="1"/>
     <w:lsdException w:name="Plain Table 1" w:uiPriority="41"/>
     <w:lsdException w:name="Plain Table 2" w:uiPriority="42"/>
     <w:lsdException w:name="Plain Table 3" w:uiPriority="43"/>
@@ -2073,7 +2773,7 @@
     <w:lsdException w:name="Unresolved Mention" w:semiHidden="1" w:unhideWhenUsed="1"/>
     <w:lsdException w:name="Smart Link" w:semiHidden="1" w:unhideWhenUsed="1"/>
   </w:latentStyles>
-  <w:style w:type="paragraph" w:default="1" w:styleId="Normal">
+  <w:style w:type="paragraph" w:styleId="Normal" w:default="1">
     <w:name w:val="Normal"/>
     <w:qFormat/>
   </w:style>
@@ -2092,7 +2792,7 @@
       <w:outlineLvl w:val="0"/>
     </w:pPr>
     <w:rPr>
-      <w:rFonts w:asciiTheme="majorHAnsi" w:eastAsiaTheme="majorEastAsia" w:hAnsiTheme="majorHAnsi" w:cstheme="majorBidi"/>
+      <w:rFonts w:asciiTheme="majorHAnsi" w:hAnsiTheme="majorHAnsi" w:eastAsiaTheme="majorEastAsia" w:cstheme="majorBidi"/>
       <w:color w:val="0F4761" w:themeColor="accent1" w:themeShade="BF"/>
       <w:sz w:val="40"/>
       <w:szCs w:val="40"/>
@@ -2114,7 +2814,7 @@
       <w:outlineLvl w:val="1"/>
     </w:pPr>
     <w:rPr>
-      <w:rFonts w:asciiTheme="majorHAnsi" w:eastAsiaTheme="majorEastAsia" w:hAnsiTheme="majorHAnsi" w:cstheme="majorBidi"/>
+      <w:rFonts w:asciiTheme="majorHAnsi" w:hAnsiTheme="majorHAnsi" w:eastAsiaTheme="majorEastAsia" w:cstheme="majorBidi"/>
       <w:color w:val="0F4761" w:themeColor="accent1" w:themeShade="BF"/>
       <w:sz w:val="32"/>
       <w:szCs w:val="32"/>
@@ -2275,13 +2975,13 @@
       <w:color w:val="272727" w:themeColor="text1" w:themeTint="D8"/>
     </w:rPr>
   </w:style>
-  <w:style w:type="character" w:default="1" w:styleId="DefaultParagraphFont">
+  <w:style w:type="character" w:styleId="DefaultParagraphFont" w:default="1">
     <w:name w:val="Default Paragraph Font"/>
     <w:uiPriority w:val="1"/>
     <w:semiHidden/>
     <w:unhideWhenUsed/>
   </w:style>
-  <w:style w:type="table" w:default="1" w:styleId="TableNormal">
+  <w:style w:type="table" w:styleId="TableNormal" w:default="1">
     <w:name w:val="Normal Table"/>
     <w:uiPriority w:val="99"/>
     <w:semiHidden/>
@@ -2296,39 +2996,39 @@
       </w:tblCellMar>
     </w:tblPr>
   </w:style>
-  <w:style w:type="numbering" w:default="1" w:styleId="NoList">
+  <w:style w:type="numbering" w:styleId="NoList" w:default="1">
     <w:name w:val="No List"/>
     <w:uiPriority w:val="99"/>
     <w:semiHidden/>
     <w:unhideWhenUsed/>
   </w:style>
-  <w:style w:type="character" w:customStyle="1" w:styleId="Heading1Char">
+  <w:style w:type="character" w:styleId="Heading1Char" w:customStyle="1">
     <w:name w:val="Heading 1 Char"/>
     <w:basedOn w:val="DefaultParagraphFont"/>
     <w:link w:val="Heading1"/>
     <w:uiPriority w:val="9"/>
     <w:rsid w:val="001B6552"/>
     <w:rPr>
-      <w:rFonts w:asciiTheme="majorHAnsi" w:eastAsiaTheme="majorEastAsia" w:hAnsiTheme="majorHAnsi" w:cstheme="majorBidi"/>
+      <w:rFonts w:asciiTheme="majorHAnsi" w:hAnsiTheme="majorHAnsi" w:eastAsiaTheme="majorEastAsia" w:cstheme="majorBidi"/>
       <w:color w:val="0F4761" w:themeColor="accent1" w:themeShade="BF"/>
       <w:sz w:val="40"/>
       <w:szCs w:val="40"/>
     </w:rPr>
   </w:style>
-  <w:style w:type="character" w:customStyle="1" w:styleId="Heading2Char">
+  <w:style w:type="character" w:styleId="Heading2Char" w:customStyle="1">
     <w:name w:val="Heading 2 Char"/>
     <w:basedOn w:val="DefaultParagraphFont"/>
     <w:link w:val="Heading2"/>
     <w:uiPriority w:val="9"/>
     <w:rsid w:val="001B6552"/>
     <w:rPr>
-      <w:rFonts w:asciiTheme="majorHAnsi" w:eastAsiaTheme="majorEastAsia" w:hAnsiTheme="majorHAnsi" w:cstheme="majorBidi"/>
+      <w:rFonts w:asciiTheme="majorHAnsi" w:hAnsiTheme="majorHAnsi" w:eastAsiaTheme="majorEastAsia" w:cstheme="majorBidi"/>
       <w:color w:val="0F4761" w:themeColor="accent1" w:themeShade="BF"/>
       <w:sz w:val="32"/>
       <w:szCs w:val="32"/>
     </w:rPr>
   </w:style>
-  <w:style w:type="character" w:customStyle="1" w:styleId="Heading3Char">
+  <w:style w:type="character" w:styleId="Heading3Char" w:customStyle="1">
     <w:name w:val="Heading 3 Char"/>
     <w:basedOn w:val="DefaultParagraphFont"/>
     <w:link w:val="Heading3"/>
@@ -2342,7 +3042,7 @@
       <w:szCs w:val="28"/>
     </w:rPr>
   </w:style>
-  <w:style w:type="character" w:customStyle="1" w:styleId="Heading4Char">
+  <w:style w:type="character" w:styleId="Heading4Char" w:customStyle="1">
     <w:name w:val="Heading 4 Char"/>
     <w:basedOn w:val="DefaultParagraphFont"/>
     <w:link w:val="Heading4"/>
@@ -2356,7 +3056,7 @@
       <w:color w:val="0F4761" w:themeColor="accent1" w:themeShade="BF"/>
     </w:rPr>
   </w:style>
-  <w:style w:type="character" w:customStyle="1" w:styleId="Heading5Char">
+  <w:style w:type="character" w:styleId="Heading5Char" w:customStyle="1">
     <w:name w:val="Heading 5 Char"/>
     <w:basedOn w:val="DefaultParagraphFont"/>
     <w:link w:val="Heading5"/>
@@ -2368,7 +3068,7 @@
       <w:color w:val="0F4761" w:themeColor="accent1" w:themeShade="BF"/>
     </w:rPr>
   </w:style>
-  <w:style w:type="character" w:customStyle="1" w:styleId="Heading6Char">
+  <w:style w:type="character" w:styleId="Heading6Char" w:customStyle="1">
     <w:name w:val="Heading 6 Char"/>
     <w:basedOn w:val="DefaultParagraphFont"/>
     <w:link w:val="Heading6"/>
@@ -2382,7 +3082,7 @@
       <w:color w:val="595959" w:themeColor="text1" w:themeTint="A6"/>
     </w:rPr>
   </w:style>
-  <w:style w:type="character" w:customStyle="1" w:styleId="Heading7Char">
+  <w:style w:type="character" w:styleId="Heading7Char" w:customStyle="1">
     <w:name w:val="Heading 7 Char"/>
     <w:basedOn w:val="DefaultParagraphFont"/>
     <w:link w:val="Heading7"/>
@@ -2394,7 +3094,7 @@
       <w:color w:val="595959" w:themeColor="text1" w:themeTint="A6"/>
     </w:rPr>
   </w:style>
-  <w:style w:type="character" w:customStyle="1" w:styleId="Heading8Char">
+  <w:style w:type="character" w:styleId="Heading8Char" w:customStyle="1">
     <w:name w:val="Heading 8 Char"/>
     <w:basedOn w:val="DefaultParagraphFont"/>
     <w:link w:val="Heading8"/>
@@ -2408,7 +3108,7 @@
       <w:color w:val="272727" w:themeColor="text1" w:themeTint="D8"/>
     </w:rPr>
   </w:style>
-  <w:style w:type="character" w:customStyle="1" w:styleId="Heading9Char">
+  <w:style w:type="character" w:styleId="Heading9Char" w:customStyle="1">
     <w:name w:val="Heading 9 Char"/>
     <w:basedOn w:val="DefaultParagraphFont"/>
     <w:link w:val="Heading9"/>
@@ -2433,21 +3133,21 @@
       <w:contextualSpacing/>
     </w:pPr>
     <w:rPr>
-      <w:rFonts w:asciiTheme="majorHAnsi" w:eastAsiaTheme="majorEastAsia" w:hAnsiTheme="majorHAnsi" w:cstheme="majorBidi"/>
+      <w:rFonts w:asciiTheme="majorHAnsi" w:hAnsiTheme="majorHAnsi" w:eastAsiaTheme="majorEastAsia" w:cstheme="majorBidi"/>
       <w:spacing w:val="-10"/>
       <w:kern w:val="28"/>
       <w:sz w:val="56"/>
       <w:szCs w:val="56"/>
     </w:rPr>
   </w:style>
-  <w:style w:type="character" w:customStyle="1" w:styleId="TitleChar">
+  <w:style w:type="character" w:styleId="TitleChar" w:customStyle="1">
     <w:name w:val="Title Char"/>
     <w:basedOn w:val="DefaultParagraphFont"/>
     <w:link w:val="Title"/>
     <w:uiPriority w:val="10"/>
     <w:rsid w:val="001B6552"/>
     <w:rPr>
-      <w:rFonts w:asciiTheme="majorHAnsi" w:eastAsiaTheme="majorEastAsia" w:hAnsiTheme="majorHAnsi" w:cstheme="majorBidi"/>
+      <w:rFonts w:asciiTheme="majorHAnsi" w:hAnsiTheme="majorHAnsi" w:eastAsiaTheme="majorEastAsia" w:cstheme="majorBidi"/>
       <w:spacing w:val="-10"/>
       <w:kern w:val="28"/>
       <w:sz w:val="56"/>
@@ -2475,7 +3175,7 @@
       <w:szCs w:val="28"/>
     </w:rPr>
   </w:style>
-  <w:style w:type="character" w:customStyle="1" w:styleId="SubtitleChar">
+  <w:style w:type="character" w:styleId="SubtitleChar" w:customStyle="1">
     <w:name w:val="Subtitle Char"/>
     <w:basedOn w:val="DefaultParagraphFont"/>
     <w:link w:val="Subtitle"/>
@@ -2507,7 +3207,7 @@
       <w:color w:val="404040" w:themeColor="text1" w:themeTint="BF"/>
     </w:rPr>
   </w:style>
-  <w:style w:type="character" w:customStyle="1" w:styleId="QuoteChar">
+  <w:style w:type="character" w:styleId="QuoteChar" w:customStyle="1">
     <w:name w:val="Quote Char"/>
     <w:basedOn w:val="DefaultParagraphFont"/>
     <w:link w:val="Quote"/>
@@ -2552,8 +3252,8 @@
     <w:rsid w:val="001B6552"/>
     <w:pPr>
       <w:pBdr>
-        <w:top w:val="single" w:sz="4" w:space="10" w:color="0F4761" w:themeColor="accent1" w:themeShade="BF"/>
-        <w:bottom w:val="single" w:sz="4" w:space="10" w:color="0F4761" w:themeColor="accent1" w:themeShade="BF"/>
+        <w:top w:val="single" w:color="0F4761" w:themeColor="accent1" w:themeShade="BF" w:sz="4" w:space="10"/>
+        <w:bottom w:val="single" w:color="0F4761" w:themeColor="accent1" w:themeShade="BF" w:sz="4" w:space="10"/>
       </w:pBdr>
       <w:spacing w:before="360" w:after="360"/>
       <w:ind w:left="864" w:right="864"/>
@@ -2565,7 +3265,7 @@
       <w:color w:val="0F4761" w:themeColor="accent1" w:themeShade="BF"/>
     </w:rPr>
   </w:style>
-  <w:style w:type="character" w:customStyle="1" w:styleId="IntenseQuoteChar">
+  <w:style w:type="character" w:styleId="IntenseQuoteChar" w:customStyle="1">
     <w:name w:val="Intense Quote Char"/>
     <w:basedOn w:val="DefaultParagraphFont"/>
     <w:link w:val="IntenseQuote"/>
@@ -2595,7 +3295,7 @@
 </file>
 
 <file path=word/theme/theme1.xml><?xml version="1.0" encoding="utf-8"?>
-<a:theme xmlns:a="http://schemas.openxmlformats.org/drawingml/2006/main" name="Office Theme">
+<a:theme xmlns:a="http://schemas.openxmlformats.org/drawingml/2006/main" xmlns:thm15="http://schemas.microsoft.com/office/thememl/2012/main" name="Office Theme">
   <a:themeElements>
     <a:clrScheme name="Office">
       <a:dk1>

</xml_diff>